<commit_message>
feat: add online spreadsheet editing, AI formula assistant, and user profile card customization
- feat: integrate online spreadsheet editor with real-time formula computation and AI formula assistant
- feat: add user profile business card dialog and avatar selector support
- test: add automated test suites for spreadsheet lifecycle, AI formula generation, and user profile cards
- docs: update project thesis draft document in docs/3.Design & Thesis
</commit_message>
<xml_diff>
--- a/docs/3.Design & Thesis/基于BS架构的企业级智能文档管理系统设计与实现-初稿.docx
+++ b/docs/3.Design & Thesis/基于BS架构的企业级智能文档管理系统设计与实现-初稿.docx
@@ -293,7 +293,7 @@
           <w:sz w:val="24"/>
           <w:rFonts w:ascii="Times New Roman" w:hAnsi="Times New Roman" w:eastAsia="宋体"/>
         </w:rPr>
-        <w:t>随着现代企业数字化转型的全面深化，企业日常运转过程中沉淀的文档数字资产呈爆发式增长，涵盖了企业章程、研发规格书、技术方案、业务合同及管理制度等多种形态。传统的企业文档管理方式普遍存在多源数据采集与整合困难、知识分类维度僵化、跨部门协同低效、文档版本演变轨迹缺失以及文档真实性与防篡改能力不足等显著痛点。借鉴《数字孪生案例汇编（2024年）》中关于“多源异构数据采集与融合、全生命周期动态感知、可信存证与防篡改溯源”的核心思想，本文设计并实现了一套基于 B/S（Browser/Server）架构的企业级智能文档管理系统（EDMS）。</w:t>
+        <w:t>随着现代企业数字化转型的深入推进，企业在日常运营、研发创新与经营管理中积累了海量的文档数字资产。传统的文档管理系统在多源异构数据采集与融合、动态协同感知、版本演变追溯以及数据防篡改与可信审计等方面存在显著痛点。借鉴《数字孪生案例汇编（2024年）》中关于“多源异构数据采集与融合、全生命周期动态感知、可信存证与防篡改溯源”的核心思想，结合现代软件工程分布式架构，本文设计并实现了一套基于 B/S（Browser/Server）架构的企业级智能文档管理系统（EDMS）。</w:t>
       </w:r>
     </w:p>
     <w:p>
@@ -310,7 +310,7 @@
           <w:sz w:val="24"/>
           <w:rFonts w:ascii="Times New Roman" w:hAnsi="Times New Roman" w:eastAsia="宋体"/>
         </w:rPr>
-        <w:t>系统采用前后端分离架构，前端依托 Vue 3、Element Plus 与 Pinia 构建高响应度的现代化 Web 界面，后端基于 Python 与 Flask 框架搭建高性能 RESTful API 路由服务，底层采用 MySQL 关系型数据库进行核心业务数据的持久化，并深度融合 WebSocket 全双工通信技术以实现实时多端数据同步。针对数据采集与可靠性问题，系统构建了“用户在线富文本编辑 + 结构化业务数据映射 + 大语言模型（LLM）对话式内容生成与跨文档知识问答”的多源数据采集链路；针对数据防篡改与审计需求，引入基于 SHA-256 密码学哈希计算与时间戳的区块链防伪存证机制，确保文档资产自“草稿生成、多级审批流转、发布生效到归档留存”的全生命周期可信存证与防篡改溯源。</w:t>
+        <w:t>系统采用前后端分离架构，前端基于 Vue 3、Element Plus 与 Pinia 技术栈构建高响应度的交互界面，后端基于 Python 与 Flask 框架搭建 RESTful API 服务，底层结合 MySQL 关系型数据库持久化存储，并基于 WebSocket 全双工通信与 Yjs CRDT（无冲突复制数据类型）算法实现多人无锁实时协同编辑。针对数据采集与可靠性问题，系统构建了“用户在线富文本编辑 + 结构化业务数据映射 + 大语言模型（LLM）对话式内容生成与跨文档检索增强（RAG）知识问答”的多源数据采集链路；在数据防篡改与可信存证方面，系统引入基于 SHA-256 哈希计算与时间戳的区块链防伪存证机制，确保文档资产从“草稿生成、多级审批流转、发布生效到归档留存”的全生命周期可信存证与不可篡改。</w:t>
       </w:r>
     </w:p>
     <w:p>
@@ -327,7 +327,7 @@
           <w:sz w:val="24"/>
           <w:rFonts w:ascii="Times New Roman" w:hAnsi="Times New Roman" w:eastAsia="宋体"/>
         </w:rPr>
-        <w:t>系统核心功能模块涵盖：多知识空间（Spaces）多对多灵活关联分类、AI 智能文档辅助生成与知识库检索、基于 WebSocket 与 CRDT（无冲突复制数据类型）的无锁实时多人协同编辑、左右分栏双向版本差异比对（Diff）、串并行文档审批工作流引擎、多维度 RBAC（用户-部门-空间）细粒度权限管控、安全审计日志以及全栈国际化（i18n）支持。经过严格的功能测试、数据防篡改可靠性验证与高并发协同性能测试，系统运行稳定高效，能够有效打破企业知识孤岛，提升全生命周期文档资产协同与可信管控水平。</w:t>
+        <w:t>系统核心功能模块包括：多知识空间（Spaces）多对多灵活关联分类、AI 智能辅助撰写与本地智库问答、基于 WebSocket 的实时多人协同编辑与光标同步、左右分栏双向版本差异比对（Diff）、串并行审批工作流引擎、三维 RBAC（用户-部门-空间）细粒度权限管控、安全审计日志以及全栈国际化（i18n）支持。经功能测试、数据防篡改可靠性验证与高并发协同性能测试，系统运行稳定高效，能够显著提升企业文档协同效率、数据可靠性与数字化资产治理水平。</w:t>
       </w:r>
     </w:p>
     <w:p>
@@ -352,7 +352,7 @@
           <w:sz w:val="24"/>
           <w:rFonts w:ascii="Times New Roman" w:hAnsi="Times New Roman" w:eastAsia="宋体"/>
         </w:rPr>
-        <w:t>B/S架构；企业文档管理系统；Vue 3；Flask；AI文档生成；实时协同；区块链存证</w:t>
+        <w:t>B/S架构；企业文档管理系统；Vue 3；Flask；AI文档生成；实时协同；CRDT；区块链存证；RBAC</w:t>
       </w:r>
     </w:p>
     <w:p>
@@ -390,7 +390,7 @@
           <w:sz w:val="24"/>
           <w:rFonts w:ascii="Times New Roman" w:hAnsi="Times New Roman" w:eastAsia="Times New Roman"/>
         </w:rPr>
-        <w:t>With the comprehensive deepening of digital transformation in modern enterprises, digital document assets generated during daily operations have grown exponentially, encompassing corporate regulations, research specifications, technical schemes, business contracts, and management protocols. Traditional document management solutions suffer from significant bottlenecks, such as difficulties in multi-source heterogeneous data collection and fusion, rigid folder hierarchies, inefficient cross-departmental collaboration, lack of version evolution traceability, and insufficient document authenticity and tamper-proofing safeguards. Drawing upon the core concepts of multi-source heterogeneous data collection and fusion, dynamic lifecycle perception, and trusted tamper-proof certification from the 'Digital Twin Case Compendium (2024)', this paper designs and implements an Enterprise Electronic Document Management System (EDMS) based on Browser/Server (B/S) architecture.</w:t>
+        <w:t>With the rapid advancement of digital transformation in modern enterprises, an enormous volume of digital document assets is continuously accumulated across daily operations, technological R&amp;D, and corporate governance. Traditional document management architectures suffer from prominent bottlenecks in multi-source heterogeneous data acquisition, real-time collaboration awareness, version evolution traceability, and cryptographic tamper-proof validation. Drawing upon the core concepts of multi-source heterogeneous data collection and fusion, dynamic lifecycle perception, and trusted certification from the 'Digital Twin Case Compendium (2024)', this paper designs and implements an Enterprise Electronic Document Management System (EDMS) based on Browser/Server (B/S) architecture.</w:t>
       </w:r>
     </w:p>
     <w:p>
@@ -407,7 +407,7 @@
           <w:sz w:val="24"/>
           <w:rFonts w:ascii="Times New Roman" w:hAnsi="Times New Roman" w:eastAsia="Times New Roman"/>
         </w:rPr>
-        <w:t>The system adopts a decoupled front-end and back-end architecture. The front-end leverages Vue 3, Element Plus, and Pinia to provide a responsive and intuitive web user interface, while the back-end utilizes Python and the Flask framework to deliver high-performance RESTful API services. MySQL is employed for relational data persistence, integrated with WebSocket full-duplex communication for real-time multi-client state synchronization. To address data acquisition and reliability requirements, a multi-source data ingestion pipeline is established, combining rich-text online editing, structured business master data mapping, and Large Language Model (LLM)-driven conversational document generation and cross-document question answering. To guarantee tamper-resistance and non-repudiation, a blockchain-inspired proofing mechanism based on SHA-256 cryptographic hashing and timestamping is implemented, ensuring immutable verification across the entire document lifecycle from draft, workflow approval, release, to archival.</w:t>
+        <w:t>The system adopts a decoupled front-end and back-end architecture. The front-end leverages Vue 3, Element Plus, and Pinia to provide a responsive and intuitive web user interface, while the back-end utilizes Python and the Flask framework to deliver high-performance RESTful API services. Relational persistence is achieved via MySQL, integrated with WebSocket full-duplex communication and Yjs Conflict-free Replicated Data Types (CRDT) for lock-free real-time collaborative editing. To satisfy multi-source data ingestion and reliability requirements, the system establishes a multi-source data pipeline combining online rich-text editing, structured master data mapping, and Large Language Model (LLM)-driven conversational generation with Retrieval-Augmented Generation (RAG) cross-document Q&amp;A. To ensure data integrity and non-repudiation, a blockchain proofing mechanism based on SHA-256 cryptographic hashing and timestamping is implemented, ensuring immutable verification across the entire document lifecycle from draft, workflow approval, release, to archival.</w:t>
       </w:r>
     </w:p>
     <w:p>
@@ -424,7 +424,7 @@
           <w:sz w:val="24"/>
           <w:rFonts w:ascii="Times New Roman" w:hAnsi="Times New Roman" w:eastAsia="Times New Roman"/>
         </w:rPr>
-        <w:t>Core functional modules include: multi-dimensional Knowledge Spaces with many-to-many associations, AI-assisted content drafting and knowledge retrieval, lock-free real-time collaborative editing based on WebSocket and Conflict-free Replicated Data Types (CRDT), side-by-side visual version difference (Diff) analysis, serial and parallel approval workflow engines, fine-grained Role-Based Access Control (RBAC across Users, Departments, and Spaces), comprehensive audit logging, and full-stack internationalization (i18n). Through functional verification, cryptographic tamper-proof validation, and concurrent stress testing, the system demonstrates high stability and responsiveness, significantly enhancing enterprise knowledge governance and trustworthy document collaboration.</w:t>
+        <w:t>Core functional modules include: multi-dimensional Knowledge Spaces with many-to-many associations, AI-assisted content drafting and local knowledge base retrieval, lock-free real-time collaborative editing based on WebSocket and CRDT, side-by-side visual version difference (Diff) analysis, serial and parallel approval workflow engines, fine-grained Role-Based Access Control (RBAC across Users, Departments, and Spaces), comprehensive audit logging, and full-stack internationalization (i18n). Through functional verification, cryptographic tamper-proof validation, and concurrent stress testing, the system demonstrates high stability and responsiveness, significantly enhancing enterprise knowledge governance and trustworthy document collaboration.</w:t>
       </w:r>
     </w:p>
     <w:p>
@@ -449,7 +449,7 @@
           <w:sz w:val="24"/>
           <w:rFonts w:ascii="Times New Roman" w:hAnsi="Times New Roman" w:eastAsia="Times New Roman"/>
         </w:rPr>
-        <w:t>B/S Architecture; Enterprise Document Management System; Vue 3; Flask; AI Document Generation; Real-time Collaboration; Blockchain Proofing</w:t>
+        <w:t>B/S Architecture; Enterprise Document Management System; Vue 3; Flask; AI Document Generation; Real-time Collaboration; CRDT; Blockchain Proofing; RBAC</w:t>
       </w:r>
     </w:p>
     <w:p>
@@ -503,7 +503,7 @@
           <w:sz w:val="24"/>
           <w:rFonts w:ascii="Times New Roman" w:hAnsi="Times New Roman" w:eastAsia="宋体"/>
         </w:rPr>
-        <w:t>在当今信息化与数字化浪潮的推动下，各类企业在日常研发、生产、运营与管理过程中产生了海量的电子文档数据。企业文档不仅是企业业务运转的直接记录，更是企业核心智慧与知识资产的重要载体。然而，传统的企业文档管理方式通常依赖分散的文件系统、局域网共享文件夹或单机 Office 软件，这种松散的管理模式在实际运作中暴露出诸多深层缺陷：</w:t>
+        <w:t>在企业数字化转型与知识经济蓬勃发展的背景下，电子文档作为企业核心业务沉淀、技术规范、合同方案与制度流程的最主要载体，其管理效率与安全性直接关乎企业的运转效能和核心竞争力[1]。周志成等人的研究表明，现代企业日常办公高度依赖各类电子文件的在线流转，传统分散式的单机文件存储或简易共享方式极易引发数据孤岛、版本冲突和资产丢失等严峻问题[1]。随着企业组织架构的日益庞大与跨部门业务交互的频繁，构建一套具备集中化、规范化与智能化特性的企业在线文档管理系统成为企业信息化建设的必然趋势[1-2]。</w:t>
       </w:r>
     </w:p>
     <w:p>
@@ -520,7 +520,7 @@
           <w:sz w:val="24"/>
           <w:rFonts w:ascii="Times New Roman" w:hAnsi="Times New Roman" w:eastAsia="宋体"/>
         </w:rPr>
-        <w:t>第一，多源异构数据整合困难。企业内部的数据来源极为广泛，既包含组织架构、审批流状态等结构化业务数据，也包含由员工日常撰写的大量非结构化富文本、Markdown 资料以及外部导入的各类文档。传统系统往往难以对多源数据进行统一归集与结构化治理，导致各业务部门之间形成严重的“数据孤岛”。</w:t>
+        <w:t>在协同办公与版本控制方面，传统文档管理模式往往通过即时通讯工具传递离散文件副本，缺乏对文档演变过程的动态感知与因果一致性维护机制[10]。何发智等学者指出，在分布式协同环境中，实现多用户并发编辑时的操作意图一致性与结果收敛是协同计算领域的关键挑战[10]。传统的悲观锁机制极大破坏了协作连贯性，而操作转换（OT）算法复杂度极高，难以满足大规模高并发实时交互的需求[8,10,15]。</w:t>
       </w:r>
     </w:p>
     <w:p>
@@ -537,7 +537,7 @@
           <w:sz w:val="24"/>
           <w:rFonts w:ascii="Times New Roman" w:hAnsi="Times New Roman" w:eastAsia="宋体"/>
         </w:rPr>
-        <w:t>第二，全生命周期协同感知与版本演化追踪缺失。在多人跨部门协同办公场景下，文档的修改往往处于割裂状态。通过即时通讯工具反复传输不同版本文件（如“最终版_修改1_定稿”），极易造成版本混淆、内容覆盖与冲突，且无法精准定位不同历史版本之间的细微差异。</w:t>
+        <w:t>与此同时，电子文档的凭证价值与合规性要求日益严格，电子文件的真实性、完整性、可用性和安全性（即“四性”）保障成为企业数字资产保护的核心诉求[13,16]。王平、聂云霞等学者深入指出，电子文件对软硬件存储环境具有高度依赖性，传统的中心化数据库存储极易面临特权人员非法篡改或被恶意攻击的数据篡改风险，难以提供具备司法效力与审计公信力的防篡改存证凭证[16-17]。区块链技术具有去中心化、数据不可篡改、时间戳可追溯等显著优势，将其引入电子文档全生命周期管理中能够为文档的真实性保障提供全新的技术范式[16,18]。</w:t>
       </w:r>
     </w:p>
     <w:p>
@@ -554,7 +554,23 @@
           <w:sz w:val="24"/>
           <w:rFonts w:ascii="Times New Roman" w:hAnsi="Times New Roman" w:eastAsia="宋体"/>
         </w:rPr>
-        <w:t>第三，数据真实性、防篡改与安全合规保障不足。在重大业务合同、技术规格书和制度规范的审批与归档过程中，传统系统无法从底层密码学角度证明文档在流转过程中是否被非法改动，缺乏具有法律效力和审计效力的不可抵赖性存证手段。</w:t>
+        <w:t>借鉴《数字孪生案例汇编（2024年）》中关于“多源异构数据采集与融合、全生命周期动态感知、可信存证与防篡改溯源”的核心理念，将物理世界的业务流转、审批协同与知识沉淀全方位映射至数字空间，并保持全流程透明可感知、可追溯与可信赖，具有极高的理论价值与工程实践意义。因此，本文设计并实现了一套基于 B/S 架构的企业级智能文档管理系统（EDMS），融合无锁实时协同、大语言模型本地智库问答与区块链防篡改存证技术，对赋能企业知识治理具有重要的应用价值。</w:t>
+      </w:r>
+    </w:p>
+    <w:p>
+      <w:pPr>
+        <w:spacing w:before="240" w:after="120" w:line="324" w:lineRule="auto"/>
+        <w:jc w:val="left"/>
+      </w:pPr>
+      <w:r>
+        <w:rPr>
+          <w:b/>
+          <w:i w:val="0"/>
+          <w:color w:val="000000"/>
+          <w:sz w:val="28"/>
+          <w:rFonts w:ascii="Times New Roman" w:hAnsi="Times New Roman" w:eastAsia="黑体"/>
+        </w:rPr>
+        <w:t>1.2  国内外研究与应用现状</w:t>
       </w:r>
     </w:p>
     <w:p>
@@ -571,23 +587,7 @@
           <w:sz w:val="24"/>
           <w:rFonts w:ascii="Times New Roman" w:hAnsi="Times New Roman" w:eastAsia="宋体"/>
         </w:rPr>
-        <w:t>借鉴《数字孪生案例汇编（2024年）》中关于“多源异构数据采集与融合、全生命周期动态感知、可信存证与防篡改溯源”的核心思想，将物理与业务实体的演化过程全面映射至数字空间，并保持全过程可感知、可追溯与可信赖，对于现代企业文档管理系统的设计具有极大的指导价值。基于 B/S（Browser/Server）架构设计并实现一套具备多源数据采集、实时协同感知、AI 智能问答与生成、以及区块链防篡改存证能力的企业级智能文档管理系统（EDMS），对提升企业协作效率、确保企业数字资产安全和推进数字化治理具有重要现实意义。</w:t>
-      </w:r>
-    </w:p>
-    <w:p>
-      <w:pPr>
-        <w:spacing w:before="240" w:after="120" w:line="324" w:lineRule="auto"/>
-        <w:jc w:val="left"/>
-      </w:pPr>
-      <w:r>
-        <w:rPr>
-          <w:b/>
-          <w:i w:val="0"/>
-          <w:color w:val="000000"/>
-          <w:sz w:val="28"/>
-          <w:rFonts w:ascii="Times New Roman" w:hAnsi="Times New Roman" w:eastAsia="黑体"/>
-        </w:rPr>
-        <w:t>1.2  研究内容</w:t>
+        <w:t>在文档管理系统架构与技术选型方面，国内外企业早期主要采用 C/S（Client/Server）架构，但由于其客户端部署繁琐、跨平台能力弱且升级维护成本高，已逐步被基于 Web 的 B/S（Browser/Server）前后端分离架构所取代[2,5,7]。王伟等在其企业档案管理系统研究中证实，采用 Vue 渐进式前端框架结合轻量级后端 API 网关的前后端分离模式，能够有效提升系统的响应性能、降低耦合度并支持高并发跨平台访问[2]。在后端技术选型上，黄昇等探索了基于 Python 与 Flask 框架的电子文档管理系统构建方案，证明了 Python 在处理非结构化数据、元数据抽取与轻量级微服务集成方面的独特敏捷优势[3]。</w:t>
       </w:r>
     </w:p>
     <w:p>
@@ -604,7 +604,7 @@
           <w:sz w:val="24"/>
           <w:rFonts w:ascii="Times New Roman" w:hAnsi="Times New Roman" w:eastAsia="宋体"/>
         </w:rPr>
-        <w:t>本文围绕现代企业对文档资产“多源采集、智能生成、高效协同、可信存证、严密管控”的综合需求，设计并实现了一套基于 B/S 架构的企业级智能文档管理系统。具体研究与实现内容包括：</w:t>
+        <w:t>在多人协同编辑与一致性维护领域，国内外学者针对并发控制算法展开了长期探索[10]。何发智等对操作意图一致性算法进行了系统性综述[10]。陈诗雨等将 WebSocket 全双工通信应用于实时协同编辑中，证实了长连接推送机制在低延迟协同中的优越性[8]。近年来，Shapiro 等人提出的无冲突复制数据类型（CRDT）因其天然的数学收敛性成为协同计算的研究前沿[8,11]。高丽萍、魏赟、刘亚等学者进一步针对树型结构富文本文档、大规模图形及二维表格场景深入研究了 CRDT 及地址空间转换算法的一致性维护机制，为富文本无锁高并发协同提供了坚实的理论支撑[11-13]。</w:t>
       </w:r>
     </w:p>
     <w:p>
@@ -621,7 +621,23 @@
           <w:sz w:val="24"/>
           <w:rFonts w:ascii="Times New Roman" w:hAnsi="Times New Roman" w:eastAsia="宋体"/>
         </w:rPr>
-        <w:t>（1）系统数据采集来源与可靠性保障体系构建：深入分析企业内生结构化数据、在线非结构化编辑流与大模型机器生成内容等多源数据采集路径，设计前置清洗、多维 RBAC 权限隔离、SHA-256 哈希指纹提取与区块链时间戳存证的多重可靠性保障机制。</w:t>
+        <w:t>在智能化应用与大模型知识库方面，窦凤岐、翟鲁杰等学者探讨了基于 LangChain 与检索增强生成（RAG）技术的本地智库系统构建方法，利用向量数据库进行私域文档切分与特征索引，有效克服了传统生成式 AI 的知识幻觉与时效滞后问题[14-15]。在安全可信存证方面，蔡盈芳、王平、聂云霞等全面分析了区块链技术在电子文件真实性保障中的存储模式，提出了“哈希值与核心元数据上链存证，全量文档下链存储”的高效防篡改策略，为本系统的可信存证模块设计提供了重要的参考依据[16-18]。</w:t>
+      </w:r>
+    </w:p>
+    <w:p>
+      <w:pPr>
+        <w:spacing w:before="240" w:after="120" w:line="324" w:lineRule="auto"/>
+        <w:jc w:val="left"/>
+      </w:pPr>
+      <w:r>
+        <w:rPr>
+          <w:b/>
+          <w:i w:val="0"/>
+          <w:color w:val="000000"/>
+          <w:sz w:val="28"/>
+          <w:rFonts w:ascii="Times New Roman" w:hAnsi="Times New Roman" w:eastAsia="黑体"/>
+        </w:rPr>
+        <w:t>1.3  研究内容与创新点</w:t>
       </w:r>
     </w:p>
     <w:p>
@@ -638,7 +654,7 @@
           <w:sz w:val="24"/>
           <w:rFonts w:ascii="Times New Roman" w:hAnsi="Times New Roman" w:eastAsia="宋体"/>
         </w:rPr>
-        <w:t>（2）基于 B/S 架构与前后端分离的系统总体设计：设计涵盖表现层、业务网关层、应用服务层与数据存储层的分层拓扑架构，规范 RESTful API 与 WebSocket 全双工通信协议。</w:t>
+        <w:t>本文围绕企业文档数字资产管理的核心痛点，基于 B/S 架构与前后端分离模式，设计并实现了一套具备多源数据采集、智能辅助、无锁协同与可信存证的企业级智能文档管理系统。具体研究内容包括：</w:t>
       </w:r>
     </w:p>
     <w:p>
@@ -655,7 +671,7 @@
           <w:sz w:val="24"/>
           <w:rFonts w:ascii="Times New Roman" w:hAnsi="Times New Roman" w:eastAsia="宋体"/>
         </w:rPr>
-        <w:t>（3）基于 CRDT 与 WebSocket 的无锁实时多人协同与版本 Diff 引擎：突破传统单人独占编辑模式，利用 WebSocket 保持长连接，结合无冲突复制数据类型（CRDT）实现毫秒级多人并发编辑与光标同步，并研发文本差分算法实现版本双向比对高亮。</w:t>
+        <w:t>（1）构建多源异构数据采集与安全清洗机制：融合企业组织架构主数据、在线富文本 ProseMirror 抽象语法树（AST）流、大模型对话生成内容以及 WebSocket 协同流转日志等多源数据，设计前置 XSS/SQL 注入清洗与元数据自动标注方案[1-3]。</w:t>
       </w:r>
     </w:p>
     <w:p>
@@ -672,7 +688,7 @@
           <w:sz w:val="24"/>
           <w:rFonts w:ascii="Times New Roman" w:hAnsi="Times New Roman" w:eastAsia="宋体"/>
         </w:rPr>
-        <w:t>（4）大语言模型（LLM）驱动的智能文档生成与跨文档知识问答：集成先进大模型接口，实现对话式文档初稿一键生成、会议纪要自动提炼与跨文档知识库精准检索问答。</w:t>
+        <w:t>（2）实现基于 CRDT 与 WebSocket 的无锁实时多人协同与版本 Diff 引擎：结合 WebSocket 长连接与 Yjs CRDT 数据模型，实现毫秒级多人并发编辑与光标同步，杜绝锁竞争；研发结构化文本差分算法，实现版本双向比对高亮[8-11,13]。</w:t>
       </w:r>
     </w:p>
     <w:p>
@@ -689,7 +705,7 @@
           <w:sz w:val="24"/>
           <w:rFonts w:ascii="Times New Roman" w:hAnsi="Times New Roman" w:eastAsia="宋体"/>
         </w:rPr>
-        <w:t>（5）文档全生命周期工作流与三维 RBAC 权限体系：构建覆盖草稿、审批中、已通过、已驳回的状态机流转引擎，实现用户-部门-知识空间三维度的细粒度权限控制与全生命周期审计日志。</w:t>
+        <w:t>（3）大模型驱动的智能文档生成与本地智库问答：集成前沿大语言模型流式生成接口，搭建基于本地向量数据库的 RAG 知识检索通道，实现企业级私域文档的深度语义召回与智能问答[14-15]。</w:t>
       </w:r>
     </w:p>
     <w:p>
@@ -706,23 +722,7 @@
           <w:sz w:val="24"/>
           <w:rFonts w:ascii="Times New Roman" w:hAnsi="Times New Roman" w:eastAsia="宋体"/>
         </w:rPr>
-        <w:t>（6）系统测试与数据可靠性验证：制定完备的测试方案，对系统功能、并发性能、防篡改校验及版本比对准确率进行全面测试与验证。</w:t>
-      </w:r>
-    </w:p>
-    <w:p>
-      <w:pPr>
-        <w:spacing w:before="240" w:after="120" w:line="324" w:lineRule="auto"/>
-        <w:jc w:val="left"/>
-      </w:pPr>
-      <w:r>
-        <w:rPr>
-          <w:b/>
-          <w:i w:val="0"/>
-          <w:color w:val="000000"/>
-          <w:sz w:val="28"/>
-          <w:rFonts w:ascii="Times New Roman" w:hAnsi="Times New Roman" w:eastAsia="黑体"/>
-        </w:rPr>
-        <w:t>1.3  论文组织结构</w:t>
+        <w:t>（4）多维 RBAC 权限隔离与审批流转状态机：构建覆盖用户、部门与多知识空间的细粒度权限矩阵，实现串并行多级审批状态自动流转引擎与安全审计日志[5-7]。</w:t>
       </w:r>
     </w:p>
     <w:p>
@@ -739,7 +739,7 @@
           <w:sz w:val="24"/>
           <w:rFonts w:ascii="Times New Roman" w:hAnsi="Times New Roman" w:eastAsia="宋体"/>
         </w:rPr>
-        <w:t>本文共分为七章，各章节的具体内容安排如下：</w:t>
+        <w:t>（5）密码学 SHA-256 与区块链时间戳防篡改存证：在文档审批通过瞬间提取数字指纹并生成链上交易凭证，提供一键链上防伪比对与篡改告警机制[16-18]。</w:t>
       </w:r>
     </w:p>
     <w:p>
@@ -756,7 +756,23 @@
           <w:sz w:val="24"/>
           <w:rFonts w:ascii="Times New Roman" w:hAnsi="Times New Roman" w:eastAsia="宋体"/>
         </w:rPr>
-        <w:t>第一章 绪论：阐述企业文档数字资产管理的研究背景与意义，分析数字孪生理念对数据生命周期管理的启示，总结系统的数据采集挑战与研究内容，介绍论文的组织结构。</w:t>
+        <w:t>（6）全系统多维度测试与性能验证：对系统功能完备性、数据可靠性、防篡改检测率及 WebSocket 并发性能进行全面测试[6,9,11]。</w:t>
+      </w:r>
+    </w:p>
+    <w:p>
+      <w:pPr>
+        <w:spacing w:before="240" w:after="120" w:line="324" w:lineRule="auto"/>
+        <w:jc w:val="left"/>
+      </w:pPr>
+      <w:r>
+        <w:rPr>
+          <w:b/>
+          <w:i w:val="0"/>
+          <w:color w:val="000000"/>
+          <w:sz w:val="28"/>
+          <w:rFonts w:ascii="Times New Roman" w:hAnsi="Times New Roman" w:eastAsia="黑体"/>
+        </w:rPr>
+        <w:t>1.4  论文组织结构</w:t>
       </w:r>
     </w:p>
     <w:p>
@@ -773,7 +789,7 @@
           <w:sz w:val="24"/>
           <w:rFonts w:ascii="Times New Roman" w:hAnsi="Times New Roman" w:eastAsia="宋体"/>
         </w:rPr>
-        <w:t>第二章 相关技术介绍：系统介绍开发所采用的技术栈，包括 B/S 架构与前后端分离模式、Python 语言与 Flask Web 框架、Vue 3 与 Element Plus 前端工程化技术、WebSocket 实时全双工通信以及大语言模型与区块链可信存证原理。</w:t>
+        <w:t>本文共分为七章，各章节内容安排如下：</w:t>
       </w:r>
     </w:p>
     <w:p>
@@ -790,7 +806,7 @@
           <w:sz w:val="24"/>
           <w:rFonts w:ascii="Times New Roman" w:hAnsi="Times New Roman" w:eastAsia="宋体"/>
         </w:rPr>
-        <w:t>第三章 系统需求与数据可靠性分析：进行技术、经济与操作可行性论证，深入分析系统的数据来源与防篡改可靠性保障策略，详细梳理系统的功能需求与非功能需求。</w:t>
+        <w:t>第一章 绪论：阐述企业文档管理的研究背景与意义，分析国内外在协同编辑、大模型智库、区块链存证及 RBAC 权限等方面的研究现状，介绍本文主要研究内容与创新点。</w:t>
       </w:r>
     </w:p>
     <w:p>
@@ -807,7 +823,7 @@
           <w:sz w:val="24"/>
           <w:rFonts w:ascii="Times New Roman" w:hAnsi="Times New Roman" w:eastAsia="宋体"/>
         </w:rPr>
-        <w:t>第四章 系统设计：给出系统总体分层架构、核心业务流程（数据采集、协同同步、审批流转、区块链存证），划分核心功能模块，并完成数据库概念模型（E-R 图）与核心数据表结构设计。</w:t>
+        <w:t>第二章 相关技术介绍：系统介绍开发所采用的技术栈，包括 B/S 架构与前后端分离、Python 语言与 Flask 框架、Vue 3 与 Element Plus 前端技术、WebSocket 与 CRDT 实时协同通信机制，以及大语言模型与区块链防篡改存证原理[2-4,8,11,14,16]。</w:t>
       </w:r>
     </w:p>
     <w:p>
@@ -824,7 +840,7 @@
           <w:sz w:val="24"/>
           <w:rFonts w:ascii="Times New Roman" w:hAnsi="Times New Roman" w:eastAsia="宋体"/>
         </w:rPr>
-        <w:t>第五章 系统实现：详细介绍系统开发环境、多源数据采集与 AI 智能模块、实时协同编辑与版本 Diff 模块、审批流与多空间管理模块、区块链存证与 RBAC 权限模块以及全栈国际化（i18n）的具体实现。</w:t>
+        <w:t>第三章 系统需求与数据可靠性分析：进行技术、经济与操作可行性分析，深入探讨系统多源数据采集与防篡改可靠性保障策略，梳理功能需求与非功能需求[1,5,13]。</w:t>
       </w:r>
     </w:p>
     <w:p>
@@ -841,7 +857,7 @@
           <w:sz w:val="24"/>
           <w:rFonts w:ascii="Times New Roman" w:hAnsi="Times New Roman" w:eastAsia="宋体"/>
         </w:rPr>
-        <w:t>第六章 系统测试与验证：阐述测试环境与方案，展示功能模块测试用例、数据防篡改与完整性校验测试、协同并发与系统性能测试的实际结果。</w:t>
+        <w:t>第四章 系统设计：给出系统总体分层架构、核心业务流程设计、七大功能模块划分，并完成数据库概念模型（E-R 图）与 14 张核心数据表结构设计[1,3,7]。</w:t>
       </w:r>
     </w:p>
     <w:p>
@@ -858,7 +874,41 @@
           <w:sz w:val="24"/>
           <w:rFonts w:ascii="Times New Roman" w:hAnsi="Times New Roman" w:eastAsia="宋体"/>
         </w:rPr>
-        <w:t>第七章 总结与展望：总结全文的研究工作与系统研发成果，指出当前系统的局限性，并对未来的技术演进方向进行展望。</w:t>
+        <w:t>第五章 系统实现：详细介绍系统开发环境、多源数据采集与 AI 模块、实时协同与版本 Diff 模块、审批流与多空间管理模块、区块链存证与 RBAC 权限模块以及全栈国际化（i18n）的具体实现[2,8,14,17]。</w:t>
+      </w:r>
+    </w:p>
+    <w:p>
+      <w:pPr>
+        <w:spacing w:before="0" w:after="120" w:line="324" w:lineRule="auto"/>
+        <w:ind w:firstLine="480"/>
+        <w:jc w:val="left"/>
+      </w:pPr>
+      <w:r>
+        <w:rPr>
+          <w:b w:val="0"/>
+          <w:i w:val="0"/>
+          <w:color w:val="000000"/>
+          <w:sz w:val="24"/>
+          <w:rFonts w:ascii="Times New Roman" w:hAnsi="Times New Roman" w:eastAsia="宋体"/>
+        </w:rPr>
+        <w:t>第六章 系统测试与验证：阐述测试环境与方案，展示功能模块测试用例、数据防篡改对比实验、RBAC 越权拦截及 WebSocket 高并发压力测试结果[6,9,11]。</w:t>
+      </w:r>
+    </w:p>
+    <w:p>
+      <w:pPr>
+        <w:spacing w:before="0" w:after="120" w:line="324" w:lineRule="auto"/>
+        <w:ind w:firstLine="480"/>
+        <w:jc w:val="left"/>
+      </w:pPr>
+      <w:r>
+        <w:rPr>
+          <w:b w:val="0"/>
+          <w:i w:val="0"/>
+          <w:color w:val="000000"/>
+          <w:sz w:val="24"/>
+          <w:rFonts w:ascii="Times New Roman" w:hAnsi="Times New Roman" w:eastAsia="宋体"/>
+        </w:rPr>
+        <w:t>第七章 总结与展望：总结全文的研究成果与工程实现，分析系统存在的局限性，并对未来联盟链接入与私有化大模型图谱拓展进行展望[16,18]。</w:t>
       </w:r>
     </w:p>
     <w:p>
@@ -928,7 +978,7 @@
           <w:sz w:val="24"/>
           <w:rFonts w:ascii="Times New Roman" w:hAnsi="Times New Roman" w:eastAsia="宋体"/>
         </w:rPr>
-        <w:t>B/S（Browser/Server，浏览器/服务器）架构是当今主流的分布式网络计算模式。在 B/S 架构下，系统的用户界面完全由标准的 Web 浏览器呈现，核心业务逻辑与数据存储则部署在后端服务器集群中。用户无需在本地计算机上安装专用的客户端软件，仅需通过 HTTP/HTTPS 协议即可随时随地访问系统全部功能。相比于传统的 C/S（Client/Server）架构，B/S 架构具备客户端零部署成本、天然跨平台（支持 Windows、macOS、Linux 及各类移动终端）、集中式升级维护以及低带宽消耗等显著优势。系统任何功能更新与安全补丁均在服务端统一完成，客户端刷新浏览器即可获取最新版本，极大地降低了企业 IT 资产的运维开销与管理成本。</w:t>
+        <w:t>B/S（Browser/Server，浏览器/服务器）架构是当今主流的分布式网络计算模式[1,5]。在 B/S 架构下，系统的用户界面完全由标准的 Web 浏览器呈现，核心业务逻辑与数据持久化部署在后端服务器集群中。用户无需在本地安装专用客户端软件，仅需通过 HTTP/HTTPS 协议即可跨平台访问系统全部功能[2]。相比传统的 C/S 架构，B/S 架构具备客户端零部署成本、天然跨操作系统（支持 Windows、macOS、Linux 等平台）、集中式版本升级以及低运维开销等显著优势[5,7]。</w:t>
       </w:r>
     </w:p>
     <w:p>
@@ -961,7 +1011,7 @@
           <w:sz w:val="24"/>
           <w:rFonts w:ascii="Times New Roman" w:hAnsi="Times New Roman" w:eastAsia="宋体"/>
         </w:rPr>
-        <w:t>前后端分离是现代 Web 架构的标准实践。前端作为一个独立的单页面应用（Single Page Application, SPA），专注于界面的交互渲染、视图组件化与用户状态管理；后端则作为无状态的 API 服务提供者，专注于业务逻辑校验、事务处理、数据持久化与安全鉴权。前后端之间通过标准化的 RESTful API 规范进行数据通信，统一采用 JSON（JavaScript Object Notation）格式传输结构化数据。该机制解除了视图展示与后端业务逻辑的强耦合，使得前端与后端可以独立迭代、独立构建与独立部署，显著提升了团队协作效率与系统的水平扩展能力。</w:t>
+        <w:t>前后端分离是现代化 Web 软件架构的标准范式[2]。王伟等的研究表明，采用 MVVM 模式的前后端分离架构能够有效解耦前端视图与后端业务逻辑[2]。前端作为一个独立的单页面应用（SPA），专注于界面的组件化渲染、动态交互与本地状态流转；后端则作为无状态的 API 服务提供者，专注于业务逻辑校验、事务处理与数据持久化。前后端之间通过标准化的 RESTful API 规范通信，统一采用 JSON（JavaScript Object Notation）格式传输结构化数据，极大地提升了系统的可维护性与水平扩展能力[2,4]。</w:t>
       </w:r>
     </w:p>
     <w:p>
@@ -1010,7 +1060,7 @@
           <w:sz w:val="24"/>
           <w:rFonts w:ascii="Times New Roman" w:hAnsi="Times New Roman" w:eastAsia="宋体"/>
         </w:rPr>
-        <w:t>Python 是一种高级、动态类型的通用解释型编程语言，以其语法简洁优雅、表达力强、代码可读性极高而著称。在企业级后端系统中，Python 拥有极其庞大且成熟的技术生态圈，特别是在数据处理、文本清洗、密码学算法以及人工智能（AI）与自然语言处理（NLP）领域具有无可比拟的统治地位。通过 Python 能够极其便捷地对接各类前沿大语言模型接口，执行高性能的向量计算、JSON 数据序列化与密码学摘要计算，为系统多源数据融合与智能化处理提供了坚实的语言支撑。</w:t>
+        <w:t>Python 是一种高级、动态类型的通用解释型编程语言，以其语法简洁优雅、表达力强、开发效率高而著称[3]。在企业级后端系统中，Python 拥有庞大且成熟的生态圈，特别是在文本处理、抽象语法树解析、密码学计算以及人工智能（AI）与自然语言处理领域占据主导地位[3,14]。通过 Python 能够极其便捷地对接各类前沿大语言模型接口，执行高性能的向量计算、JSON 数据序列化与密码学摘要计算，为系统多源数据融合与智能化处理提供了坚实的语言支撑[3,15]。</w:t>
       </w:r>
     </w:p>
     <w:p>
@@ -1043,7 +1093,7 @@
           <w:sz w:val="24"/>
           <w:rFonts w:ascii="Times New Roman" w:hAnsi="Times New Roman" w:eastAsia="宋体"/>
         </w:rPr>
-        <w:t>Flask 是基于 Python 语言的轻量级 WSGI Web 应用框架，由 Armin Ronacher 设计。与重量级框架不同，Flask 秉承“微核心”设计哲学，仅保留 URL 路由映射、请求响应封装、会话管理等最核心的 Web 功能，其余扩展功能（如数据库 ORM、认证授权、WebSocket 等）均通过成熟的插件机制按需集成。Flask 采用基于装饰器的路由分发机制，支持蓝图（Blueprints）模块化架构，能够清晰地将用户管理、空间流转、审批引擎、AI 对话及存证服务划分为高内聚、低耦合的独立业务子模块，非常契合微服务化演进与敏捷开发需求。</w:t>
+        <w:t>Flask 是基于 Python 语言的轻量级 WSGI Web 应用框架，由 Armin Ronacher 设计。黄昇等人在高校电子文档管理系统研发中指出，Flask 秉承“微核心”设计哲学，核心仅保留 URL 路由映射、请求响应封装和会话管理，具有极高的灵活性与可扩展性[3]。Flask 采用基于装饰器的路由分发机制，支持蓝图（Blueprints）模块化架构，能够清晰地将用户管理、空间流转、审批引擎、AI 对话及存证服务划分为高内聚、低耦合的独立业务子模块，非常契合现代微服务化演进需求[3]。</w:t>
       </w:r>
     </w:p>
     <w:p>
@@ -1076,7 +1126,7 @@
           <w:sz w:val="24"/>
           <w:rFonts w:ascii="Times New Roman" w:hAnsi="Times New Roman" w:eastAsia="宋体"/>
         </w:rPr>
-        <w:t>SQLAlchemy 是 Python 领域最为强大且工业级成熟的对象关系映射（Object-Relational Mapping, ORM）框架。它通过在面向对象编程语言中的“类-对象”与关系型数据库中的“表-行记录”之间建立严密的映射关系，使得开发者可以使用面向对象的方式执行数据库查询、事务提交、外键级联与复杂关联操作，从而彻底摆脱了手写原生 SQL 所带来的语法碎片化与 SQL 注入风险。同时，SQLAlchemy 提供了强大的底层连接池管理与多对多关联中间表映射机制，有力保障了系统在高并发场景下的事务 ACID 特性与数据持久化可靠性。</w:t>
+        <w:t>SQLAlchemy 是 Python 领域工业级成熟的对象关系映射（ORM）框架。它通过在面向对象编程语言中的“实体类”与关系型数据库中的“数据表”之间建立严密的映射关系，使得开发者可以使用面向对象的方式执行数据库查询、事务提交、外键级联与复杂关联操作，从而彻底摆脱了手写原生 SQL 所带来的语法碎片化与 SQL 注入风险[1,3]。同时，SQLAlchemy 提供了强大的底层连接池管理与多对多关联中间表映射机制，有力保障了系统在高并发场景下的事务 ACID 特性与数据持久化可靠性。</w:t>
       </w:r>
     </w:p>
     <w:p>
@@ -1108,7 +1158,7 @@
           <w:sz w:val="24"/>
           <w:rFonts w:ascii="Times New Roman" w:hAnsi="Times New Roman" w:eastAsia="黑体"/>
         </w:rPr>
-        <w:t>2.3.1 Vue 3 组合式 API（Composition API）与响应式原理</w:t>
+        <w:t>2.3.1 Vue 3 组合式 API 与响应式原理</w:t>
       </w:r>
     </w:p>
     <w:p>
@@ -1125,7 +1175,7 @@
           <w:sz w:val="24"/>
           <w:rFonts w:ascii="Times New Roman" w:hAnsi="Times New Roman" w:eastAsia="宋体"/>
         </w:rPr>
-        <w:t>Vue 3 是当前前端工程化领域最前沿的渐进式 JavaScript 框架。Vue 3 引入了全新的组合式 API（Composition API），通过 setup() 语法糖与响应式核心函数（ref, reactive, computed, watch），使开发者能够将紧密关联的业务逻辑代码聚合组织在一起，有效解决了传统 Options API 在复杂大型组件中代码分散、逻辑难以复用的痛点。在底层响应式实现上，Vue 3 采用 ES6 原生 Proxy 对象全面替代了 Vue 2 的 Object.defineProperty，实现了对复杂嵌套对象、数组索引变更及属性动态增删的高性能拦截监听，整体内存占用降低了约 50%，渲染性能获得了大幅飞跃。</w:t>
+        <w:t>Vue 3 是当前前端工程化领域最前沿的渐进式 JavaScript 框架[2,4]。刘冰等在其系统研究中指出，Vue 的组件化思想与响应式数据绑定能够极大提高前端界面的复用性与开发效率[4]。Vue 3 引入了全新的组合式 API（Composition API），通过 setup() 语法糖与响应式核心函数（ref, reactive, computed），使开发者能够将紧密关联的业务逻辑代码聚合组织在一起。在底层响应式实现上，Vue 3 采用 ES6 原生 Proxy 对象全面替代了 Object.defineProperty，实现了对复杂嵌套对象与数组索引变更的高性能拦截监听，整体内存占用更低且渲染性能显著提升[4]。</w:t>
       </w:r>
     </w:p>
     <w:p>
@@ -1141,7 +1191,7 @@
           <w:sz w:val="24"/>
           <w:rFonts w:ascii="Times New Roman" w:hAnsi="Times New Roman" w:eastAsia="黑体"/>
         </w:rPr>
-        <w:t>2.3.2 Element Plus 组件库与交互界面设计</w:t>
+        <w:t>2.3.2 Element Plus 组件库与交互设计</w:t>
       </w:r>
     </w:p>
     <w:p>
@@ -1158,7 +1208,7 @@
           <w:sz w:val="24"/>
           <w:rFonts w:ascii="Times New Roman" w:hAnsi="Times New Roman" w:eastAsia="宋体"/>
         </w:rPr>
-        <w:t>Element Plus 是基于 Vue 3 打造的现代化桌面端企业级 UI 组件库，由饿了么前端团队开源并持续维护。Element Plus 提供了涵盖布局容器、数据表格、树形控件、表单输入、模态弹窗、步骤条及通知提醒在内的 60 余种高质量基础组件，完全遵循统一的企业级视觉规范。其具备完备的暗黑模式适配、极佳的无障碍访问支持以及高度可定制的 CSS 变量主题体系，极大地提升了系统的界面美观度、交互一致性与前端开发效率。</w:t>
+        <w:t>Element Plus 是基于 Vue 3 打造的现代化桌面端企业级 UI 组件库。Element Plus 提供了涵盖布局容器、数据表格、树形控件、表单输入、模态弹窗、步骤条及通知提醒在内的 60 余种高质量基础组件，完全遵循统一的企业级视觉规范。其具备完备的暗黑模式适配、极佳的无障碍访问支持以及高度可定制的 CSS 变量主题体系，极大地提升了系统的界面美观度、交互一致性与前端开发效率[2,4]。</w:t>
       </w:r>
     </w:p>
     <w:p>
@@ -1191,7 +1241,7 @@
           <w:sz w:val="24"/>
           <w:rFonts w:ascii="Times New Roman" w:hAnsi="Times New Roman" w:eastAsia="宋体"/>
         </w:rPr>
-        <w:t>Pinia 是 Vue 官方推荐的新一代集中式状态管理库。相比于传统的 Vuex，Pinia 移除了冗余繁琐的 mutations 概念，原生提供对 TypeScript 强类型的完整推导，支持状态（State）、计算属性（Getters）与动作（Actions）的直观定义。系统利用 Pinia 管理用户身份令牌（Token）、全局语言环境（Locale）、当前协同文档元数据等核心全局状态。配合 Vue Router 的全局前置路由守卫（beforeEach），能够在路由跳转前执行 JWT 鉴权校验与权限拦截，确保未经授权的用户无法非法访问受保护的受限页面。</w:t>
+        <w:t>Pinia 是 Vue 官方推荐的新一代集中式状态管理库。相比于传统的 Vuex，Pinia 移除了冗余的 mutations，原生提供对 TypeScript 强类型的完整推导，支持状态（State）、计算属性（Getters）与动作（Actions）的直观定义。系统利用 Pinia 管理用户身份令牌（Token）、全局语言环境（Locale）、当前协同文档元数据等核心全局状态。配合 Vue Router 的全局前置路由守卫（beforeEach），能够在路由跳转前执行 JWT 鉴权校验与权限拦截，确保未经授权的用户无法非法访问受保护页面[4,6]。</w:t>
       </w:r>
     </w:p>
     <w:p>
@@ -1240,7 +1290,7 @@
           <w:sz w:val="24"/>
           <w:rFonts w:ascii="Times New Roman" w:hAnsi="Times New Roman" w:eastAsia="宋体"/>
         </w:rPr>
-        <w:t>传统的 HTTP 协议属于无状态的单向请求-响应模式，客户端发起一次请求，服务端才能返回一次数据，在多人实时协作场景下若采用轮询机制会造成巨大的网络开销与不可接受的时延。WebSocket 协议（RFC 6455）定义了一种在单个 TCP 连接上进行全双工（Full-Duplex）双向通信的标准机制。客户端在与服务端完成一次标准 HTTP 握手升级后，连接将长久保持开放，服务端与客户端均可随时主动向对方推送轻量级的二进制或文本数据帧。系统利用 WebSocket 维护多用户在线通道，实现毫秒级的状态分发、实时通知推送与协同操作广播。</w:t>
+        <w:t>传统的 HTTP 协议属于无状态的单向“拉取（Pull）”请求-响应模式，在多人实时协作场景下若采用轮询机制会造成巨大的网络开销与不可接受的时延[8-9]。曹文彬等深入研究了基于事件驱动的高性能 WebSocket 服务器设计，指出采用 WebSocket 全双工长连接以“推送（Push）”方式进行实时消息传递，能够在高并发连接下保持极低的传输延迟与服务器资源开销[9]。陈诗雨等进一步证实，WebSocket 建立的长连接通信管道是支撑多人实时协同编辑的理想基础设施[8]。系统利用 WebSocket 维护多用户在线通道，实现毫秒级的状态分发、实时通知推送与协同操作广播[8-9]。</w:t>
       </w:r>
     </w:p>
     <w:p>
@@ -1273,7 +1323,7 @@
           <w:sz w:val="24"/>
           <w:rFonts w:ascii="Times New Roman" w:hAnsi="Times New Roman" w:eastAsia="宋体"/>
         </w:rPr>
-        <w:t>在多人并发协同编辑同一文档时，传统的集中锁机制（Locking）会剥夺其他用户的编辑权，严重破坏协作体验；而操作转换算法（OT, Operational Transformation）对中央协调服务器的依赖极高且算法复杂度呈指数级上升。系统引入基于无冲突复制数据类型（CRDT, Conflict-free Replicated Data Types）的协同机制。CRDT 是一种数学上经过形式化证明的分布式数据结构，每个客户端在本地产生编辑操作后即可直接应用于本地文档树，同时将增量二进制 Update 片段通过 WebSocket 广播给其他对等端。由于 CRDT 的操作满足交换律、结合律与幂等性，各终端接收到并发更新并应用后，最终必定收敛为完全一致的文档状态，从而实现了真正的去中心化、无锁高并发实时协同。</w:t>
+        <w:t>在多人并发协同编辑同一文档时，传统的集中锁机制会剥夺其他用户的编辑权，严重破坏协作体验[8]；而操作转换（OT）算法对中央服务器强依赖且因果倒置转换复杂度极高[10,15]。Shapiro 提出的无冲突复制数据类型（CRDT, Conflict-free Replicated Data Types）作为一种新兴的分布式一致性维护机制，通过数学上满足半格（Semilattice）特性的交换律、结合律与幂等性，保证各对等节点在无序接收增量 Update 后最终必然收敛到完全一致的状态[8,11-12]。高丽萍、魏赟、刘亚等学者进一步针对树型结构富文本文档与二维表格等复杂数据形态提出了基于 CRDT 的无锁冲突消解方案[11-13]。系统基于 Yjs CRDT 框架，协作者在本地产生的编辑操作直接应用于本地文档树并生成二进制增量包，通过 WebSocket 广播给其他对等端，实现了真正的去中心化、无锁高并发实时协同[8,11,13]。</w:t>
       </w:r>
     </w:p>
     <w:p>
@@ -1305,7 +1355,7 @@
           <w:sz w:val="24"/>
           <w:rFonts w:ascii="Times New Roman" w:hAnsi="Times New Roman" w:eastAsia="黑体"/>
         </w:rPr>
-        <w:t>2.5.1 大语言模型接口集成与知识库问答</w:t>
+        <w:t>2.5.1 大语言模型接口集成与 RAG 知识库问答</w:t>
       </w:r>
     </w:p>
     <w:p>
@@ -1322,7 +1372,7 @@
           <w:sz w:val="24"/>
           <w:rFonts w:ascii="Times New Roman" w:hAnsi="Times New Roman" w:eastAsia="宋体"/>
         </w:rPr>
-        <w:t>大语言模型（Large Language Models, LLMs）通过海量文本的无监督预训练与指令微调，具备了极其强大的语义理解、上下文逻辑推理与多风格文本生成能力。系统通过标准 API 网关无缝集成前沿大语言模型（如 DeepSeek 等），并利用 HTTP SSE（Server-Sent Events）/流式传输（Streaming）技术将模型生成的文本实时推送到前端 ProseMirror/Tiptap 编辑器中。同时，系统构建了基于本地向量数据库的检索增强生成（RAG, Retrieval-Augmented Generation）通道，将企业历史文档按段落切分、向量化并建立索引，实现跨文档的精准语义召回与智能问答，使静态的企业文档资产转化为可交互的动态知识库。</w:t>
+        <w:t>大语言模型（LLM）具备卓越的语义理解、上下文逻辑推理与多风格文本生成能力[14-15]。窦凤岐、翟鲁杰等学者研究了基于 LangChain 与检索增强生成（RAG）技术的本地智库系统构建方法[14-15]。RAG 技术通过将私域文档按语义分块并转化为高维稠密向量存入向量数据库，在用户提问时通过余弦相似度精准检索最相关的上下文片段并拼接至大模型 Prompt 中，有效克服了传统大模型的幻觉问题与专业领域知识欠缺缺陷[14-15]。系统通过标准 API 网关集成大语言模型，并利用 Server-Sent Events（SSE）流式协议将生成内容打字机式实时推送到富文本编辑器中[14-15]。</w:t>
       </w:r>
     </w:p>
     <w:p>
@@ -1355,7 +1405,7 @@
           <w:sz w:val="24"/>
           <w:rFonts w:ascii="Times New Roman" w:hAnsi="Times New Roman" w:eastAsia="宋体"/>
         </w:rPr>
-        <w:t>数据防篡改与可信审计是现代企业文档管理的核心诉求。密码学安全哈希算法 SHA-256 能够将任意长度的文档二进制内容映射为固定长度为 256 位（64 位十六进制字符）的唯一数字指纹。SHA-256 具有严格的单向不可逆性、碰撞阻抗性以及雪崩效应（输入文本即使改变单个比特，输出哈希值也会发生翻天覆地的变化）。区块链技术通过将带有时间戳的交易数据打包成区块，并利用密码学哈希指针依次链接成不可篡改的分布式账本。系统在文档审批通过生效的瞬间，自动计算文档内容与元数据的 SHA-256 指纹，并附加权威时间戳生成存证凭证写入区块链存证账本。在后续审计时，只需对当前文档重新计算哈希并与链上凭证进行哈希比对，若哈希完全一致则证明文档未被任何人为篡改，从而构建起坚固的数据可靠性防线。</w:t>
+        <w:t>数据防篡改与可信审计是电子文档安全管理的核心底线[13,16]。王平、聂云霞、蔡盈芳等学者深入探讨了区块链技术在电子档案真实性保障与长期可信保存中的应用[16-18]。密码学安全哈希算法 SHA-256 能够将任意长度的文档二进制数据映射为固定 256 位的唯一数字指纹，具备极强的碰撞阻抗性与雪崩效应[17]。蔡盈芳提出“仅哈希值与部分核心元数据上链，全量文档下链存储”的混合存储架构，既大幅降低了区块链存储开销，又兼顾了保密性与防篡改真实性验证需求[18]。系统在文档审批通过生效的瞬间，自动计算文档正文与元数据的 SHA-256 哈希值，附加时间戳生成存证凭证写入区块链账本，从而构建起坚固的数据可靠性防线[16-18]。</w:t>
       </w:r>
     </w:p>
     <w:p>
@@ -1425,7 +1475,7 @@
           <w:sz w:val="24"/>
           <w:rFonts w:ascii="Times New Roman" w:hAnsi="Times New Roman" w:eastAsia="宋体"/>
         </w:rPr>
-        <w:t>系统采用 Vue 3 + Element Plus + Pinia 作为前端核心技术栈，基于 Python + Flask + SQLAlchemy 搭建后端服务，底层存储采用成熟的 MySQL 8.0 关系型数据库，实时协同基于标准的 WebSocket 与 CRDT 算法构建。所选用的框架与工具均为经过全球工业界大规模验证的顶级开源项目，具有完备的开发文档、庞大的开发者社区支持以及极其活跃的生态系统。系统各模块分工明确，技术链路清晰可控，不存在难以突破的技术壁垒，因而在技术上完全可行。</w:t>
+        <w:t>系统采用 Vue 3 + Element Plus + Pinia 作为前端核心技术栈，基于 Python + Flask + SQLAlchemy 搭建后端服务，底层存储采用成熟的 MySQL 8.0 关系型数据库，实时协同基于 WebSocket 与 Yjs CRDT 算法构建[2-4,8,11]。所选用的框架与工具均为经过工业界与学术界深度验证的开源项目，具有完备的文档与活跃的开发者社区，技术链路清晰可控，不存在技术壁垒，因而在技术上完全可行[1,3]。</w:t>
       </w:r>
     </w:p>
     <w:p>
@@ -1458,7 +1508,7 @@
           <w:sz w:val="24"/>
           <w:rFonts w:ascii="Times New Roman" w:hAnsi="Times New Roman" w:eastAsia="宋体"/>
         </w:rPr>
-        <w:t>系统全栈基于成熟的开源软件与开放标准进行研发，无需向第三方商业厂商支付高昂的软件专利授权费与商业中间件许可费。系统运行仅需常规的企业云服务器或普通 x86 服务器即可满足运行需求，对硬件配置要求极为平易；同时，系统支持 Docker 容器化一键部署与极简运维，能够极大地缩减企业前期的研发投入与后期的系统运维成本，在经济上具有显著的可行性与极高的投资回报比。</w:t>
+        <w:t>系统全栈基于成熟的开源软件与开放标准研发，无需支付商业中间件及专有数据库许可费用[1,3]。系统可在普通的云主机或 x86 服务器上稳定运行，硬件门槛低；同时支持 Docker 容器化一键部署与极简运维，极大压缩了企业研发投入与后续运维成本，经济上具有显著的可行性[2,5]。</w:t>
       </w:r>
     </w:p>
     <w:p>
@@ -1491,7 +1541,7 @@
           <w:sz w:val="24"/>
           <w:rFonts w:ascii="Times New Roman" w:hAnsi="Times New Roman" w:eastAsia="宋体"/>
         </w:rPr>
-        <w:t>系统基于现代 B/S 架构开发，终端用户只需通过各类现代浏览器（Chrome、Edge、Safari 等）即可直接访问系统全部功能，彻底免去了繁琐的客户端安装与环境配置过程。前端界面设计充分遵循 Element Plus 现代扁平化与人性化人机交互规范，布局清晰直观，提供全局中英文无缝切换、富文本所见即所得编辑、一键审批以及可视化版本差异对比等便捷操作，普通企业员工无需经过专门的技术培训即可熟练上手操作，在实际使用与日常运维中具备完全的操作可行性。</w:t>
+        <w:t>系统基于现代 B/S 架构开发，用户无需安装客户端，通过主流浏览器即可直接操作使用全部功能[1,5]。前端界面设计严格遵循 Element Plus 交互规范，布局直观清晰，支持全局中英文无缝切换、所见即所得富文本编辑、一键审批及可视化版本 Diff 对比等便捷操作，普通员工无需专门培训即可熟练使用，具备完全的操作可行性[2,4]。</w:t>
       </w:r>
     </w:p>
     <w:p>
@@ -1540,7 +1590,7 @@
           <w:sz w:val="24"/>
           <w:rFonts w:ascii="Times New Roman" w:hAnsi="Times New Roman" w:eastAsia="宋体"/>
         </w:rPr>
-        <w:t>数字孪生的核心前提在于对物理与业务实体全面、精准的多源数据感知与融合。本系统结合现代企业复杂的办公生态，构建了覆盖四类关键维度的多源异构数据采集通道：</w:t>
+        <w:t>数字孪生与现代知识治理的核心前提在于对物理与业务实体全面、精准的多源数据感知与融合[16]。本系统构建了覆盖四类关键维度的多源异构数据采集通道：</w:t>
       </w:r>
     </w:p>
     <w:p>
@@ -1557,7 +1607,7 @@
           <w:sz w:val="24"/>
           <w:rFonts w:ascii="Times New Roman" w:hAnsi="Times New Roman" w:eastAsia="宋体"/>
         </w:rPr>
-        <w:t>1. 系统内生结构化数据采集：涵盖企业组织架构主数据（部门表、职位表）、员工用户基本档案、多级审批流程状态机节点、权限分配矩阵以及操作审计日志。该部分数据具有严格的关系型结构和字段约束，由系统管理流程中原生录入产生。</w:t>
+        <w:t>1. 系统内生结构化数据采集：涵盖企业组织架构主数据（部门表、职位表）、员工用户基本档案、多级审批流程状态机节点、权限分配矩阵以及操作审计日志。该部分数据具有严格的关系型结构和字段约束，由系统管理流程中原生录入产生[1,7]。</w:t>
       </w:r>
     </w:p>
     <w:p>
@@ -1574,7 +1624,7 @@
           <w:sz w:val="24"/>
           <w:rFonts w:ascii="Times New Roman" w:hAnsi="Times New Roman" w:eastAsia="宋体"/>
         </w:rPr>
-        <w:t>2. 非结构化在线富文本编辑流数据：由企业员工在 ProseMirror/Tiptap 在线富文本编辑器中自主撰写的日常工作文档、规章制度、技术规格书与项目立项方案。该部分数据以标准 JSON 抽象语法树（AST）及 Markdown 格式动态流式采集。</w:t>
+        <w:t>2. 非结构化在线富文本编辑流数据：由企业员工在 ProseMirror 在线富文本编辑器中自主撰写的日常工作文档、规章制度、技术规格书与项目立项方案。该部分数据以标准 JSON 抽象语法树（AST）及 Markdown 格式动态流式采集[3,13]。</w:t>
       </w:r>
     </w:p>
     <w:p>
@@ -1591,7 +1641,7 @@
           <w:sz w:val="24"/>
           <w:rFonts w:ascii="Times New Roman" w:hAnsi="Times New Roman" w:eastAsia="宋体"/>
         </w:rPr>
-        <w:t>3. 大模型机器生成与问答交互数据：用户利用系统内置的 AI 智能助理生成的文档初稿、会议纪要摘要提炼、逻辑润色内容以及基于企业历史文档库的跨文档问答对话历史记录。该部分数据具有高度的语义丰富性与动态演化特征。</w:t>
+        <w:t>3. 大模型机器生成与问答交互数据：用户利用系统内置 AI 智能助理生成的文档初稿、会议纪要摘要提炼、逻辑润色内容以及基于企业历史文档库的跨文档问答对话历史记录。该部分数据具有高度的语义丰富性与动态演化特征[14-15]。</w:t>
       </w:r>
     </w:p>
     <w:p>
@@ -1608,7 +1658,7 @@
           <w:sz w:val="24"/>
           <w:rFonts w:ascii="Times New Roman" w:hAnsi="Times New Roman" w:eastAsia="宋体"/>
         </w:rPr>
-        <w:t>4. 动态协同交互与状态机流转数据：包含基于 WebSocket 实时广播的多人并发编辑增量 Update 包、用户光标实时感知坐标、审批流程各节点的审批决策理由以及文档流转状态变更轨迹。</w:t>
+        <w:t>4. 动态协同交互与状态机流转数据：包含基于 WebSocket 实时广播的多人并发编辑增量 Update 包、用户光标实时感知坐标、审批流程各节点的审批决策理由以及文档流转状态变更轨迹[8,10,13]。</w:t>
       </w:r>
     </w:p>
     <w:p>
@@ -1641,7 +1691,7 @@
           <w:sz w:val="24"/>
           <w:rFonts w:ascii="Times New Roman" w:hAnsi="Times New Roman" w:eastAsia="宋体"/>
         </w:rPr>
-        <w:t>针对上述多源异构数据的流动特点，系统设计并实现了“端到端全链路可信保障体系”，从数据录入、权限隔离、状态流转到防伪存证全过程捍卫数据的可靠性与真实性：</w:t>
+        <w:t>针对多源异构数据的流动与持久化特点，系统设计并实现了“端到端全链路可信保障体系”，捍卫数据的可靠性、完整性与真实性[13,16]：</w:t>
       </w:r>
     </w:p>
     <w:p>
@@ -1658,7 +1708,7 @@
           <w:sz w:val="24"/>
           <w:rFonts w:ascii="Times New Roman" w:hAnsi="Times New Roman" w:eastAsia="宋体"/>
         </w:rPr>
-        <w:t>1. 前置输入清洗与格式强校验：在 API 网关层与前端输入层对所有提交的数据进行双重清洗，过滤非法字符、防止 XSS 跨站脚本攻击与 SQL 注入攻击；对富文本 JSON 语法树进行规范性检查，确保入库数据的完整与合法。</w:t>
+        <w:t>1. 前置输入清洗与格式强校验：在 API 网关层与前端输入层对所有提交的数据进行双重清洗，过滤非法字符、防止 XSS 跨站脚本攻击与 SQL 注入攻击；对富文本 JSON 语法树进行规范性检查，确保入库数据的完整与合法[2,5]。</w:t>
       </w:r>
     </w:p>
     <w:p>
@@ -1675,7 +1725,7 @@
           <w:sz w:val="24"/>
           <w:rFonts w:ascii="Times New Roman" w:hAnsi="Times New Roman" w:eastAsia="宋体"/>
         </w:rPr>
-        <w:t>2. 多维 RBAC 权限严密隔离：建立覆盖“用户-部门-知识空间”三维度的细粒度权限控制机制（拥有者 owner、编辑 edit、评论 comment、只读 view/reader）。未获得相应授权的用户无法执行写操作，杜绝了非法越权写入与篡改的风险。</w:t>
+        <w:t>2. 多维 RBAC 权限严密隔离：彭思喜、喻燕华、张鑫等的研究表明，基于角色的访问控制（RBAC）能够有效规范用户权限，防止越权访问与恶意篡改[5-7]。系统建立覆盖“用户-部门-知识空间”三维度的细粒度权限控制机制（拥有者 owner、编辑 edit、评论 comment、只读 view/reader），杜绝越权写入与篡改风险[5-7]。</w:t>
       </w:r>
     </w:p>
     <w:p>
@@ -1692,7 +1742,7 @@
           <w:sz w:val="24"/>
           <w:rFonts w:ascii="Times New Roman" w:hAnsi="Times New Roman" w:eastAsia="宋体"/>
         </w:rPr>
-        <w:t>3. SHA-256 密码学指纹计算与区块链存证：文档在审批通过生效的瞬间，系统自动提取标题、版本正文、作者与时间戳等元数据，使用 SHA-256 计算全局唯一的文档哈希指纹，并作为不可更改的存证凭证写入区块链存证账本。在任何审计节点，系统均支持对文档重新计算哈希并与链上凭证进行瞬时比对，一旦发现单字改动立即向系统管理员触发红线告警。</w:t>
+        <w:t>3. SHA-256 密码学指纹计算与区块链存证：王平、聂云霞、蔡盈芳等指出，区块链哈希存证能够为电子文件提供不可抵赖的真实性凭证[16-18]。文档在审批通过生效的瞬间，系统自动提取标题、版本正文、作者与时间戳等元数据，使用 SHA-256 计算全局唯一的文档哈希指纹，并作为不可更改的存证凭证写入区块链存证账本。在任何审计节点，系统支持对文档重新计算哈希并与链上凭证进行瞬时比对，一旦发现单字改动立即触发红线告警[16-18]。</w:t>
       </w:r>
     </w:p>
     <w:p>
@@ -1709,7 +1759,7 @@
           <w:sz w:val="24"/>
           <w:rFonts w:ascii="Times New Roman" w:hAnsi="Times New Roman" w:eastAsia="宋体"/>
         </w:rPr>
-        <w:t>4. 状态机生命周期控制与不可变版本快照：文档遵循“草稿（draft） -&gt; 审批中（in_approval） -&gt; 已通过（approved） / 已驳回（rejected）”的严格状态机跃迁。一旦文档进入审批中或已通过状态，正文内容即被锁定；后续任何改动必须派生出递增的全新版本快照（DocumentVersion），历史版本正文只读归档，结合左右分栏 Diff 差分算法实现版本演化轨迹 100% 可审计、可追溯。</w:t>
+        <w:t>4. 状态机生命周期控制与不可变版本快照：文档遵循“草稿（draft） -&gt; 审批中（in_approval） -&gt; 已通过（approved） / 已驳回（rejected）”的严格状态机跃迁[1,3]。一旦文档进入审批中或已通过状态，正文内容即被锁定；后续任何改动必须派生出递增的全新版本快照（DocumentVersion），历史版本正文只读归档，结合左右分栏 Diff 差分算法实现版本演化轨迹 100% 可审计、可追溯[10,13]。</w:t>
       </w:r>
     </w:p>
     <w:p>
@@ -1742,7 +1792,7 @@
           <w:sz w:val="24"/>
           <w:rFonts w:ascii="Times New Roman" w:hAnsi="Times New Roman" w:eastAsia="宋体"/>
         </w:rPr>
-        <w:t>为满足企业现代知识管理与协同办公的实际业务场景，系统经过详尽的业务调研，梳理出以下七大核心功能需求：</w:t>
+        <w:t>结合现代企业知识协同管理实际业务场景，梳理出以下七大核心功能需求[1,3]：</w:t>
       </w:r>
     </w:p>
     <w:p>
@@ -1759,7 +1809,7 @@
           <w:sz w:val="24"/>
           <w:rFonts w:ascii="Times New Roman" w:hAnsi="Times New Roman" w:eastAsia="宋体"/>
         </w:rPr>
-        <w:t>（1）多空间知识分类管理需求：突破传统单层或树状文件目录的机械限制，支持用户创建多个独立的业务知识空间（Spaces），实现单个文档与多个知识空间之间的多对多（Many-to-Many）灵活关联，支持按空间进行穿透检索与分类聚合。</w:t>
+        <w:t>（1）多空间知识分类管理需求：突破传统单层或树状文件目录的机械限制，支持用户创建多个独立的业务知识空间（Spaces），实现单个文档与多个知识空间之间的多对多（Many-to-Many）灵活关联，支持按空间进行穿透检索与分类聚合[1,3]。</w:t>
       </w:r>
     </w:p>
     <w:p>
@@ -1776,7 +1826,7 @@
           <w:sz w:val="24"/>
           <w:rFonts w:ascii="Times New Roman" w:hAnsi="Times New Roman" w:eastAsia="宋体"/>
         </w:rPr>
-        <w:t>（2）AI 智能辅助与知识问答需求：支持基于大语言模型的文档智能起草、润色续写、会议纪要提炼，以及基于本地企业知识库的跨文档多轮深度问答与关键信息定位。</w:t>
+        <w:t>（2）AI 智能辅助与知识问答需求：支持基于大语言模型的文档智能起草、润色续写、会议纪要提炼，以及基于本地向量知识库的跨文档多轮深度问答与关键信息定位[14-15]。</w:t>
       </w:r>
     </w:p>
     <w:p>
@@ -1793,7 +1843,7 @@
           <w:sz w:val="24"/>
           <w:rFonts w:ascii="Times New Roman" w:hAnsi="Times New Roman" w:eastAsia="宋体"/>
         </w:rPr>
-        <w:t>（3）实时在线协同与版本 Diff 比对需求：支持多人同时在线并发编辑同一篇富文本文档，实时显示各协作者的光标位置与编辑选区；系统自动记录文档版本演进历史，提供左右分栏的可视化版本差异（Diff）高亮比对功能。</w:t>
+        <w:t>（3）实时在线协同与版本 Diff 比对需求：支持多人同时在线并发编辑同一篇富文本文档，实时显示各协作者的光标位置与编辑选区；系统自动记录文档版本演进历史，提供左右分栏的可视化版本差异（Diff）高亮比对功能[8,10,13]。</w:t>
       </w:r>
     </w:p>
     <w:p>
@@ -1810,7 +1860,7 @@
           <w:sz w:val="24"/>
           <w:rFonts w:ascii="Times New Roman" w:hAnsi="Times New Roman" w:eastAsia="宋体"/>
         </w:rPr>
-        <w:t>（4）多级审批流转与任务中心需求：支持串行（按步骤顺序审批）与并行（多人会签）审批工作流；提供统一的任务收件箱，审批人员可查看待办任务、文档正文、历史审批意见并执行同意或驳回操作。</w:t>
+        <w:t>（4）多级审批流转与任务中心需求：支持串行（按步骤顺序审批）与并行（多人会签）审批工作流；提供统一的任务收件箱，审批人员可查看待办任务、文档正文、历史审批意见并执行同意或驳回操作[1,3]。</w:t>
       </w:r>
     </w:p>
     <w:p>
@@ -1827,7 +1877,7 @@
           <w:sz w:val="24"/>
           <w:rFonts w:ascii="Times New Roman" w:hAnsi="Times New Roman" w:eastAsia="宋体"/>
         </w:rPr>
-        <w:t>（5）细粒度 RBAC 权限控制需求：提供基于角色的访问控制体系，支持针对组织架构部门、具体人员及特定文档分配精细化的权限（包括查看、编辑、评论、管理及审批权限）。</w:t>
+        <w:t>（5）细粒度 RBAC 权限控制需求：提供基于角色的访问控制体系，支持针对组织架构部门、具体人员及特定文档分配精细化的权限（包括查看、编辑、评论、管理及审批权限）[5-7]。</w:t>
       </w:r>
     </w:p>
     <w:p>
@@ -1844,7 +1894,7 @@
           <w:sz w:val="24"/>
           <w:rFonts w:ascii="Times New Roman" w:hAnsi="Times New Roman" w:eastAsia="宋体"/>
         </w:rPr>
-        <w:t>（6）区块链防篡改存证与溯源验证需求：系统自动为已审批文档生成密码学哈希指纹并在链上存证，提供链上存证哈希查询、防伪校验检测及防篡改审计报告导出功能。</w:t>
+        <w:t>（6）区块链防篡改存证与溯源验证需求：系统自动为已审批文档生成密码学哈希指纹并在链上存证，提供链上存证哈希查询、防伪校验检测及防篡改审计报告导出功能[16-18]。</w:t>
       </w:r>
     </w:p>
     <w:p>
@@ -1861,7 +1911,7 @@
           <w:sz w:val="24"/>
           <w:rFonts w:ascii="Times New Roman" w:hAnsi="Times New Roman" w:eastAsia="宋体"/>
         </w:rPr>
-        <w:t>（7）全栈国际化（i18n）需求：支持系统界面与枚举字典的中英文双语无缝实时热切换，满足跨国企业及涉外团队的无障碍协同办公需求。</w:t>
+        <w:t>（7）全栈国际化（i18n）需求：支持系统界面与枚举字典的中英文双语无缝实时热切换，满足跨国企业及涉外团队的无障碍协同办公需求[2,4]。</w:t>
       </w:r>
     </w:p>
     <w:p>
@@ -1894,7 +1944,7 @@
           <w:sz w:val="24"/>
           <w:rFonts w:ascii="Times New Roman" w:hAnsi="Times New Roman" w:eastAsia="宋体"/>
         </w:rPr>
-        <w:t>除了完备的业务功能之外，企业级系统在非功能性指标上同样具有极高的要求：</w:t>
+        <w:t>系统在非功能性指标上具有以下严格要求[1,5,9]：</w:t>
       </w:r>
     </w:p>
     <w:p>
@@ -1911,7 +1961,7 @@
           <w:sz w:val="24"/>
           <w:rFonts w:ascii="Times New Roman" w:hAnsi="Times New Roman" w:eastAsia="宋体"/>
         </w:rPr>
-        <w:t>（1）安全性与合规性：用户密码采用业界标准的安全加盐哈希（PBKDF2/Werkzeug）算法存储；所有 API 接口采用基于 JWT 的身份认证与签名校验；建立完备的系统审计日志（AuditLog），对文档的查看、导出、删除及权限变更等敏感操作实现全量记录与永久归档。</w:t>
+        <w:t>（1）安全性与合规性：用户密码采用业界标准的安全加盐哈希（PBKDF2/Werkzeug）算法存储；所有 API 接口采用基于 JWT 的身份认证与签名校验；建立完备的系统审计日志（AuditLog），对文档的查看、导出、删除及权限变更等敏感操作实现全量记录与永久归档[5-7]。</w:t>
       </w:r>
     </w:p>
     <w:p>
@@ -1928,7 +1978,7 @@
           <w:sz w:val="24"/>
           <w:rFonts w:ascii="Times New Roman" w:hAnsi="Times New Roman" w:eastAsia="宋体"/>
         </w:rPr>
-        <w:t>（2）低延迟与高实时性：WebSocket 协同长连接的消息广播端到端时延低于 50 毫秒，前端页面路由切换与异步数据渲染响应时间控制在 200 毫秒以内，保障极致流畅的沉浸式编辑体验。</w:t>
+        <w:t>（2）低延迟与高实时性：WebSocket 协同长连接的消息广播端到端时延低于 50 毫秒，前端页面路由切换与异步数据渲染响应时间控制在 200 毫秒以内，保障极致流畅的沉浸式编辑体验[8-9]。</w:t>
       </w:r>
     </w:p>
     <w:p>
@@ -1945,7 +1995,7 @@
           <w:sz w:val="24"/>
           <w:rFonts w:ascii="Times New Roman" w:hAnsi="Times New Roman" w:eastAsia="宋体"/>
         </w:rPr>
-        <w:t>（3）高并发与数据一致性：系统在多用户并发协同与高频 API 请求场景下，能够确保数据库事务的完整性与强一致性；通过 CRDT 冲突消解算法与乐观并发控制，杜绝数据覆盖与竞争冒险。</w:t>
+        <w:t>（3）高并发与数据一致性：系统在多用户并发协同与高频 API 请求场景下，能够确保数据库事务的完整性与强一致性；通过 CRDT 冲突消解算法与乐观并发控制，杜绝数据覆盖与竞争冒险[10-12]。</w:t>
       </w:r>
     </w:p>
     <w:p>
@@ -1962,7 +2012,7 @@
           <w:sz w:val="24"/>
           <w:rFonts w:ascii="Times New Roman" w:hAnsi="Times New Roman" w:eastAsia="宋体"/>
         </w:rPr>
-        <w:t>（4）模块化可扩展性与可维护性：前后端遵循严格的组件化与分层设计原则，模块间依赖解耦，代码结构清晰，支持方便地向分布式集群与容器云平台平滑迁移。</w:t>
+        <w:t>（4）模块化可扩展性与可维护性：前后端遵循严格的组件化与分层设计原则，模块间依赖解耦，代码结构清晰，支持方便地向分布式集群与容器云平台平滑迁移[2-3]。</w:t>
       </w:r>
     </w:p>
     <w:p>
@@ -2032,7 +2082,7 @@
           <w:sz w:val="24"/>
           <w:rFonts w:ascii="Times New Roman" w:hAnsi="Times New Roman" w:eastAsia="宋体"/>
         </w:rPr>
-        <w:t>系统严格遵循经典的前后端分离分层体系结构，自顶向下划分为表现层（Client Presentation Layer）、业务网关与通信层（Gateway &amp; Transport Layer）、应用服务层（Application Service Layer）以及数据与存证持久层（Data &amp; Proof Layer）。</w:t>
+        <w:t>系统遵循经典的前后端分离分层体系结构[2]，自顶向下划分为表现层（Client Presentation Layer）、业务网关与通信层（Gateway &amp; Transport Layer）、应用服务层（Application Service Layer）以及数据与存证持久层（Data &amp; Proof Layer）。</w:t>
       </w:r>
     </w:p>
     <w:p>
@@ -2049,7 +2099,7 @@
           <w:sz w:val="24"/>
           <w:rFonts w:ascii="Times New Roman" w:hAnsi="Times New Roman" w:eastAsia="宋体"/>
         </w:rPr>
-        <w:t>1. 表现层（Client UI）：运行于现代 Web 浏览器终端，基于 Vue 3 + TypeScript 构建，包含路由模块（Vue Router）、全局状态流（Pinia）、富文本协同编辑器（Tiptap/ProseMirror）、版本差异比对器（Diff Viewer）、AI 对话侧边栏以及 Element Plus 现代化组件库。</w:t>
+        <w:t>1. 表现层（Client UI）：运行于现代 Web 浏览器终端，基于 Vue 3 + TypeScript 构建，包含路由模块（Vue Router）、全局状态流（Pinia）、富文本协同编辑器（Tiptap/ProseMirror）、版本差异比对器（Diff Viewer）、AI 对话侧边栏以及 Element Plus 现代化组件库[2,4]。</w:t>
       </w:r>
     </w:p>
     <w:p>
@@ -2066,7 +2116,7 @@
           <w:sz w:val="24"/>
           <w:rFonts w:ascii="Times New Roman" w:hAnsi="Times New Roman" w:eastAsia="宋体"/>
         </w:rPr>
-        <w:t>2. 业务网关与通信层（Gateway &amp; Sockets）：负责拦截与解析客户端请求。包含 RESTful API HTTP/HTTPS 网关（负责 JWT 认证、跨域处理 CORS 与权限守卫拦截）以及 WebSocket 长连接协同服务器（负责客户端房间管理、二进制 CRDT 消息广播与心跳保活）。</w:t>
+        <w:t>2. 业务网关与通信层（Gateway &amp; Sockets）：负责拦截与解析客户端请求。包含 RESTful API HTTP/HTTPS 网关（负责 JWT 认证、跨域处理 CORS 与权限守卫拦截）以及 WebSocket 长连接协同服务器（负责客户端房间管理、二进制 CRDT 消息广播与心跳保活）[8-9]。</w:t>
       </w:r>
     </w:p>
     <w:p>
@@ -2083,7 +2133,7 @@
           <w:sz w:val="24"/>
           <w:rFonts w:ascii="Times New Roman" w:hAnsi="Times New Roman" w:eastAsia="宋体"/>
         </w:rPr>
-        <w:t>3. 应用服务层（Core Business Services）：承载系统的核心业务逻辑。划分为文档空间服务（Document &amp; Space Service）、实时协同服务（Collab Service）、审批工作流引擎（Approval Flow Engine）、AI 智能交互与问答服务（AI &amp; Vector Service）、版本差分算法服务（Diff Service）以及区块链存证服务（Blockchain Proof Service）。</w:t>
+        <w:t>3. 应用服务层（Core Business Services）：承载系统的核心业务逻辑。划分为文档空间服务（Document &amp; Space Service）、实时协同服务（Collab Service）、审批工作流引擎（Approval Flow Engine）、AI 智能交互与问答服务（AI &amp; Vector Service）、版本差分算法服务（Diff Service）以及区块链存证服务（Blockchain Proof Service）[1,3,14,17]。</w:t>
       </w:r>
     </w:p>
     <w:p>
@@ -2100,7 +2150,7 @@
           <w:sz w:val="24"/>
           <w:rFonts w:ascii="Times New Roman" w:hAnsi="Times New Roman" w:eastAsia="宋体"/>
         </w:rPr>
-        <w:t>4. 数据与存证持久层（Persistence &amp; Blockchain）：负责核心数据的持久化与防篡改存证。包含 MySQL 8.0 关系型数据库（通过 SQLAlchemy ORM 管理实体持久化）、本地向量数据库（Qdrant/FastEmbed 存储文档知识嵌入向量）以及区块链分布式账本（存储哈希指纹与交易凭证）。</w:t>
+        <w:t>4. 数据与存证持久层（Persistence &amp; Blockchain）：负责核心数据的持久化与防篡改存证。包含 MySQL 8.0 关系型数据库（通过 SQLAlchemy ORM 管理实体持久化）、本地向量数据库（Qdrant/FastEmbed 存储文档知识嵌入向量）以及区块链分布式账本（存储哈希指纹与交易凭证）[3,15,18]。</w:t>
       </w:r>
     </w:p>
     <w:p>
@@ -2133,7 +2183,7 @@
           <w:sz w:val="24"/>
           <w:rFonts w:ascii="Times New Roman" w:hAnsi="Times New Roman" w:eastAsia="宋体"/>
         </w:rPr>
-        <w:t>系统前后端通信采用“双轨并行”协议体系：常规的元数据查询、用户认证、工作流流转与系统配置采用标准的 HTTP/HTTPS + RESTful JSON 协议，请求头携带 Authorization: Bearer &lt;JWT_Token&gt; 进行无状态身份鉴权；而在文档实时协同编辑与全局通知推送场景下，系统自动建立 WebSocket 全双工通道，客户端与服务端之间通过高效的二进制数据帧传输 Yjs Update 片段，极大降低了网络传输开销并提升了交互实时性。</w:t>
+        <w:t>系统前后端通信采用“双轨并行”协议体系[2,8]：常规的元数据查询、用户认证、工作流流转与系统配置采用标准的 HTTP/HTTPS + RESTful JSON 协议，请求头携带 Authorization: Bearer &lt;JWT_Token&gt; 进行无状态身份鉴权；而在文档实时协同编辑与全局通知推送场景下，系统自动建立 WebSocket 全双工通道，客户端与服务端之间通过高效的二进制数据帧传输 Yjs Update 片段，极大降低了网络传输开销并提升了交互实时性[8-9]。</w:t>
       </w:r>
     </w:p>
     <w:p>
@@ -2182,7 +2232,7 @@
           <w:sz w:val="24"/>
           <w:rFonts w:ascii="Times New Roman" w:hAnsi="Times New Roman" w:eastAsia="宋体"/>
         </w:rPr>
-        <w:t>当用户在系统在线富文本编辑器中录入内容或通过 AI 助手生成初稿时，前端编辑器将文本解析为标准的 ProseMirror 抽象语法树（JSON 格式）。提交后，后端 API 网关首先执行前置防注入过滤与 XSS 清洗，随后由文档服务提取纯文本元数据（摘要、标签、分类）。在后台异步通道中，文本被切块并转化为向量特征存入向量索引库，完成从非结构化文本到可检索知识资产的数字化重构。</w:t>
+        <w:t>当用户在系统在线富文本编辑器中录入内容或通过 AI 助手生成初稿时，前端编辑器将文本解析为标准的 ProseMirror 抽象语法树（JSON 格式）[13]。提交后，后端 API 网关首先执行前置防注入过滤与 XSS 清洗，随后由文档服务提取纯文本元数据（摘要、标签、分类）。在后台异步通道中，文本被切块并转化为向量特征存入向量索引库，完成从非结构化文本到可检索知识资产的数字化重构[14-15]。</w:t>
       </w:r>
     </w:p>
     <w:p>
@@ -2215,7 +2265,7 @@
           <w:sz w:val="24"/>
           <w:rFonts w:ascii="Times New Roman" w:hAnsi="Times New Roman" w:eastAsia="宋体"/>
         </w:rPr>
-        <w:t>当多名用户同时打开同一篇文档时，前端自动向 WebSocket 协同服务器发送加入房间（Join Room）事件。协同服务器为该文档维护一个包含在线用户集合的协同室（Room）。协作者在本地产生的任何敲击与选区变更，均被封装为原子级 CRDT Update 包与 Awareness 状态包，通过 WebSocket 广播至同房间内的其他协作者。各客户端在本地应用增量更新并即时重绘，数学上的偏序关系保障了所有协作者看到的文档视图无锁最终一致。</w:t>
+        <w:t>当多名用户同时打开同一篇文档时，前端自动向 WebSocket 协同服务器发送加入房间（Join Room）事件[8]。协同服务器为该文档维护一个包含在线用户集合的协同室（Room）。协作者在本地产生的任何敲击与选区变更，均被封装为原子级 CRDT Update 包与 Awareness 状态包，通过 WebSocket 广播至同房间内的其他协作者[8,11]。各客户端在本地应用增量更新并即时重绘，数学上的偏序关系保障了所有协作者看到的文档视图无锁最终一致[10-12]。</w:t>
       </w:r>
     </w:p>
     <w:p>
@@ -2248,7 +2298,7 @@
           <w:sz w:val="24"/>
           <w:rFonts w:ascii="Times New Roman" w:hAnsi="Times New Roman" w:eastAsia="宋体"/>
         </w:rPr>
-        <w:t>文档全生命周期状态机涵盖草稿（draft）、审批中（in_approval）、已通过（approved）与已驳回（rejected）四种核心状态。文档创建者发起审批后，系统根据选择的审批模式（串行或并行）初始化 ApprovalFlow 实例并分配 ApprovalParticipant 节点，文档状态跃迁为 in_approval，此时正文被锁定禁止编辑。审批人员通过任务中心查阅并签署意见，若所有审批人均同意，文档状态跃迁为 approved，触发区块链存证服务；若任一审批人驳回，文档状态退回 rejected，重新开放给作者修改。</w:t>
+        <w:t>文档全生命周期状态机涵盖草稿（draft）、审批中（in_approval）、已通过（approved）与已驳回（rejected）四种核心状态[1]。文档创建者发起审批后，系统根据选择的审批模式（串行或并行）初始化 ApprovalFlow 实例并分配 ApprovalParticipant 节点，文档状态跃迁为 in_approval，此时正文被锁定禁止编辑。审批人员通过任务中心查阅并签署意见，若所有审批人均同意，文档状态跃迁为 approved，触发区块链存证服务；若任一审批人驳回，文档状态退回 rejected，重新开放给作者修改[1,3]。</w:t>
       </w:r>
     </w:p>
     <w:p>
@@ -2281,7 +2331,7 @@
           <w:sz w:val="24"/>
           <w:rFonts w:ascii="Times New Roman" w:hAnsi="Times New Roman" w:eastAsia="宋体"/>
         </w:rPr>
-        <w:t>当文档审批通过跃迁至 approved 状态时，系统后台存证服务自动被触发。服务将文档的当前版本正文（content_json）、标题（title）、所属空间、版本号及时间戳等核心字段序列化为标准不可变字符串，调用 SHA-256 算法计算出 64 位的文档哈希指纹（file_hash）。随后，存证服务将该指纹打包提交至区块链存证网络，生成不可篡改的链上交易凭证哈希（tx_hash）并持久化回填至文档记录中。后续任何时刻，审计人员均可点击“防伪验证”，系统重新提取当前内容计算哈希并与链上凭证比对，验证结果清晰可视。</w:t>
+        <w:t>当文档审批通过跃迁至 approved 状态时，系统后台存证服务自动被触发[16,18]。服务将文档的当前版本正文（content_json）、标题（title）、所属空间、版本号及时间戳等核心字段序列化为标准不可变字符串，调用 SHA-256 算法计算出 64 位的文档哈希指纹（file_hash）。随后，存证服务将该指纹打包提交至区块链存证网络，生成不可篡改的链上交易凭证哈希（tx_hash）并持久化回填至文档记录中[17-18]。后续任何时刻，审计人员均可点击“防伪验证”，系统重新提取当前内容计算哈希并与链上凭证比对，验证结果清晰可视[16,18]。</w:t>
       </w:r>
     </w:p>
     <w:p>
@@ -2314,7 +2364,7 @@
           <w:sz w:val="24"/>
           <w:rFonts w:ascii="Times New Roman" w:hAnsi="Times New Roman" w:eastAsia="宋体"/>
         </w:rPr>
-        <w:t>系统功能划分为七大核心模块，各模块职责明确、协同工作，共同构成了完备的企业级智能文档资产治理平台：</w:t>
+        <w:t>系统功能划分为七大核心模块，各模块职责明确、协同工作，共同构成了完备的企业级智能文档资产治理平台[1,3]：</w:t>
       </w:r>
     </w:p>
     <w:p>
@@ -2331,7 +2381,7 @@
           <w:sz w:val="24"/>
           <w:rFonts w:ascii="Times New Roman" w:hAnsi="Times New Roman" w:eastAsia="宋体"/>
         </w:rPr>
-        <w:t>1. 知识空间与文档资产管理模块：负责多知识空间的创建、配置与维护；支持文档的新建、移动、分享、软删除与回收站恢复；支持单个文档与多个空间的多对多挂载关联与按空间穿透检索。</w:t>
+        <w:t>1. 知识空间与文档资产管理模块：负责多知识空间的创建、配置与维护；支持文档的新建、移动、分享、软删除与回收站恢复；支持单个文档与多个空间的多对多挂载关联与按空间穿透检索[1,3]。</w:t>
       </w:r>
     </w:p>
     <w:p>
@@ -2348,7 +2398,7 @@
           <w:sz w:val="24"/>
           <w:rFonts w:ascii="Times New Roman" w:hAnsi="Times New Roman" w:eastAsia="宋体"/>
         </w:rPr>
-        <w:t>2. AI 智能助理与知识抽取模块：提供对话式文档生成、段落续写、内容润色、结构化会议纪要提炼以及基于本地向量知识库的跨文档多轮深度问答功能。</w:t>
+        <w:t>2. AI 智能助理与知识抽取模块：提供对话式文档生成、段落续写、内容润色、结构化会议纪要提炼以及基于本地向量知识库的跨文档多轮深度问答功能[14-15]。</w:t>
       </w:r>
     </w:p>
     <w:p>
@@ -2365,7 +2415,7 @@
           <w:sz w:val="24"/>
           <w:rFonts w:ascii="Times New Roman" w:hAnsi="Times New Roman" w:eastAsia="宋体"/>
         </w:rPr>
-        <w:t>3. 实时协同与版本控制模块：负责 WebSocket 协同房间维护、用户在线光标感知同步、文档历史版本快照生成以及左右分栏的双向版本 Diff 差异高亮比对。</w:t>
+        <w:t>3. 实时协同与版本控制模块：负责 WebSocket 协同房间维护、用户在线光标感知同步、文档历史版本快照生成以及左右分栏的双向版本 Diff 差异高亮比对[8,10,13]。</w:t>
       </w:r>
     </w:p>
     <w:p>
@@ -2382,7 +2432,7 @@
           <w:sz w:val="24"/>
           <w:rFonts w:ascii="Times New Roman" w:hAnsi="Times New Roman" w:eastAsia="宋体"/>
         </w:rPr>
-        <w:t>4. 审批流与任务中心模块：支持串行与并行多级审批流程定义；提供任务收件箱、发起审批、撤回审批、审批意见批注及审批状态动态流转机制。</w:t>
+        <w:t>4. 审批流与任务中心模块：支持串行与并行多级审批流程定义；提供任务收件箱、发起审批、撤回审批、审批意见批注及审批状态动态流转机制[1,3]。</w:t>
       </w:r>
     </w:p>
     <w:p>
@@ -2399,7 +2449,7 @@
           <w:sz w:val="24"/>
           <w:rFonts w:ascii="Times New Roman" w:hAnsi="Times New Roman" w:eastAsia="宋体"/>
         </w:rPr>
-        <w:t>5. RBAC 权限与安全审计模块：负责企业组织架构（部门、职位、用户）维护；实现覆盖用户-部门-空间维度的细粒度权限鉴权；对系统核心操作生成不可逆安全审计日志（AuditLog）。</w:t>
+        <w:t>5. RBAC 权限与安全审计模块：负责企业组织架构（部门、职位、用户）维护；实现覆盖用户-部门-空间维度的细粒度权限鉴权；对系统核心操作生成不可逆安全审计日志（AuditLog）[5-7]。</w:t>
       </w:r>
     </w:p>
     <w:p>
@@ -2416,7 +2466,7 @@
           <w:sz w:val="24"/>
           <w:rFonts w:ascii="Times New Roman" w:hAnsi="Times New Roman" w:eastAsia="宋体"/>
         </w:rPr>
-        <w:t>6. 区块链可信存证与防伪校验模块：负责审批通过文档的 SHA-256 哈希计算、区块链存证上链、链上凭证查询、防伪校验检测及存证证书导出。</w:t>
+        <w:t>6. 区块链可信存证与防伪校验模块：负责审批通过文档的 SHA-256 哈希计算、区块链存证上链、链上凭证查询、防伪校验检测及存证证书导出[16-18]。</w:t>
       </w:r>
     </w:p>
     <w:p>
@@ -2433,7 +2483,7 @@
           <w:sz w:val="24"/>
           <w:rFonts w:ascii="Times New Roman" w:hAnsi="Times New Roman" w:eastAsia="宋体"/>
         </w:rPr>
-        <w:t>7. 全栈国际化配置模块：提供中英文双语界面词条管理、前端 Vue-i18n 动态切换与后端枚举字典多语言响应适配。</w:t>
+        <w:t>7. 全栈国际化配置模块：提供中英文双语界面词条管理、前端 Vue-i18n 动态切换与后端枚举字典多语言响应适配[2,4]。</w:t>
       </w:r>
     </w:p>
     <w:p>
@@ -2482,7 +2532,7 @@
           <w:sz w:val="24"/>
           <w:rFonts w:ascii="Times New Roman" w:hAnsi="Times New Roman" w:eastAsia="宋体"/>
         </w:rPr>
-        <w:t>依据系统的业务实体及其流转逻辑，系统涉及的核心实体包括：用户（User）、部门（Department）、职位（Position）、知识空间（Space）、文档（Document）、文档版本（DocumentVersion）、文档权限（DocumentPermission）、文档评论（Comment）、审批流程（ApprovalFlow）、审批参与人（ApprovalParticipant）、审批决策（ApprovalDecision）、系统审计日志（AuditLog）以及系统通知（Notification）。</w:t>
+        <w:t>依据系统的业务实体及其流转逻辑，系统涉及的核心实体包括：用户（User）、部门（Department）、职位（Position）、知识空间（Space）、文档（Document）、文档版本（DocumentVersion）、文档权限（DocumentPermission）、文档评论（Comment）、审批流程（ApprovalFlow）、审批参与人（ApprovalParticipant）、审批决策（ApprovalDecision）、系统审计日志（AuditLog）以及系统通知（Notification）[1,3,7]。</w:t>
       </w:r>
     </w:p>
     <w:p>
@@ -2499,7 +2549,7 @@
           <w:sz w:val="24"/>
           <w:rFonts w:ascii="Times New Roman" w:hAnsi="Times New Roman" w:eastAsia="宋体"/>
         </w:rPr>
-        <w:t>各实体之间的核心联系如下：（1）部门与用户：一对多关系，一个部门包含多名员工；（2）用户与文档：一对多关系，一个用户可以拥有多篇文档；（3）文档与知识空间：多对多关系，通过 document_spaces 关联表映射，一篇文档可以归属于多个知识空间；（4）文档与文档版本：一对多关系，一篇文档包含多个历史版本快照；（5）文档与文档权限：一对多关系，一篇文档可以为不同用户分配不同的访问权限；（6）文档与审批流：一对多关系，一篇文档可发起多次审批流程；（7）审批流与审批参与人：一对多关系，一个流程包含多个审批节点；（8）审批参与人与审批决策：一对一关系，每个审批人对所属节点提交一条审批决策；（9）文档版本与评论：一对多关系，每个版本可包含多条行内批注与讨论。</w:t>
+        <w:t>各实体之间的核心联系如下：（1）部门与用户：一对多关系，一个部门包含多名员工；（2）用户与文档：一对多关系，一个用户可以拥有多篇文档；（3）文档与知识空间：多对多关系，通过 document_spaces 关联表映射，一篇文档可以归属于多个知识空间；（4）文档与文档版本：一对多关系，一篇文档包含多个历史版本快照；（5）文档与文档权限：一对多关系，一篇文档可以为不同用户分配不同的访问权限；（6）文档与审批流：一对多关系，一篇文档可发起多次审批流程；（7）审批流与审批参与人：一对多关系，一个流程包含多个审批节点；（8）审批参与人与审批决策：一对一关系，每个审批人对所属节点提交一条审批决策；（9）文档版本与评论：一对多关系，每个版本可包含多条行内批注与讨论[1,3,7]。</w:t>
       </w:r>
     </w:p>
     <w:p>
@@ -2532,7 +2582,7 @@
           <w:sz w:val="24"/>
           <w:rFonts w:ascii="Times New Roman" w:hAnsi="Times New Roman" w:eastAsia="宋体"/>
         </w:rPr>
-        <w:t>根据概念模型与实际代码实现，系统在 MySQL 8.0 数据库中设计并建立了 14 张核心业务数据表，所有表默认采用 utf8mb4 字符集以完美支持各类多语言及富文本字符。核心数据表结构详见表 4-1 至表 4-14。</w:t>
+        <w:t>根据概念模型与实际代码实现，系统在 MySQL 8.0 数据库中设计并建立了 14 张核心业务数据表，所有表默认采用 utf8mb4 字符集以完美支持多语言及富文本字符。核心数据表结构详见表 4-1 至表 4-14[1,3,7]。</w:t>
       </w:r>
     </w:p>
     <w:p>
@@ -14982,7 +15032,7 @@
           <w:sz w:val="24"/>
           <w:rFonts w:ascii="Times New Roman" w:hAnsi="Times New Roman" w:eastAsia="宋体"/>
         </w:rPr>
-        <w:t>系统开发与运行部署环境如表 5-1 所示。整套系统基于 Docker 容器化技术进行封装编排，支持在 Linux 与 Windows 环境下一键构建与跨平台交付。</w:t>
+        <w:t>系统开发与运行部署环境如表 5-1 所示。整套系统基于 Docker 容器化技术进行封装编排，支持在 Linux 与 Windows 环境下一键构建与跨平台交付[2-3]。</w:t>
       </w:r>
     </w:p>
     <w:p>
@@ -16029,7 +16079,7 @@
           <w:sz w:val="24"/>
           <w:rFonts w:ascii="Times New Roman" w:hAnsi="Times New Roman" w:eastAsia="宋体"/>
         </w:rPr>
-        <w:t>后端采用工厂模式（Factory Pattern）构建 Flask Application 实例，通过 extensions.py 统一初始化 SQLAlchemy、CORS、SocketIO 等核心扩展插件。针对前后端分离开发模式下的跨域资源共享问题，后端集成 flask_cors 模块，对来自前端开发服务器（如 http://localhost:5173）的 OPTIONS 预检请求与携带凭证的 HTTP 请求进行全局 CORS 策略放行，并统一在 HTTP Header 中注入 X-Frame-Options 与 Content-Security-Policy 增强安全防护。</w:t>
+        <w:t>后端采用工厂模式构建 Flask Application 实例，通过 extensions.py 统一初始化 SQLAlchemy、CORS、SocketIO 等核心扩展插件[3]。针对前后端分离开发模式下的跨域资源共享问题，后端集成 flask_cors 模块，对来自前端开发服务器的 OPTIONS 预检请求与携带凭证的 HTTP 请求进行全局 CORS 策略放行，并统一在 HTTP Header 中注入 X-Frame-Options 与 Content-Security-Policy 增强安全防护[2,4]。</w:t>
       </w:r>
     </w:p>
     <w:p>
@@ -16061,7 +16111,7 @@
           <w:sz w:val="24"/>
           <w:rFonts w:ascii="Times New Roman" w:hAnsi="Times New Roman" w:eastAsia="黑体"/>
         </w:rPr>
-        <w:t>5.2.1 AI 辅助文档生成与智能知识问答实现</w:t>
+        <w:t>5.2.1 AI 辅助文档生成与本地智库问答实现</w:t>
       </w:r>
     </w:p>
     <w:p>
@@ -16078,7 +16128,7 @@
           <w:sz w:val="24"/>
           <w:rFonts w:ascii="Times New Roman" w:hAnsi="Times New Roman" w:eastAsia="宋体"/>
         </w:rPr>
-        <w:t>AI 智能服务封装在 AIService 类中。系统通过异步流式（Stream）通道对接大语言模型接口。在文档智能生成场景中，用户在前端对话框中输入撰写主题（如“企业网络安全防护制度”），后端 ai_generate 路由接收请求并构造精准的 System Prompt 约束生成格式为标准 Markdown。利用 Flask 的 Response(stream_with_context(...), mimetype='text/event-stream')，后端将模型产生的 Token 实时推送到前端，前端 ProseMirror 编辑器实时捕获流式内容并动态转化为富文本节点插入正文，实现流畅的打字机式生成体验。</w:t>
+        <w:t>AI 智能服务封装在 AIService 类中。系统通过异步流式（Stream）通道对接大语言模型接口[14-15]。在文档智能生成场景中，用户在前端对话框中输入撰写主题（如“企业网络安全管理规范”），后端 ai_generate 路由接收请求并构造精准的 System Prompt 约束生成格式为标准 Markdown。利用 Flask 的 Response(stream_with_context(...), mimetype='text/event-stream')，后端将模型产生的 Token 实时推送到前端，前端 ProseMirror 编辑器实时捕获流式内容并动态转化为富文本节点插入正文，实现打字机式生成体验[14-15]。</w:t>
       </w:r>
     </w:p>
     <w:p>
@@ -16095,7 +16145,7 @@
           <w:sz w:val="24"/>
           <w:rFonts w:ascii="Times New Roman" w:hAnsi="Times New Roman" w:eastAsia="宋体"/>
         </w:rPr>
-        <w:t>在跨文档知识库问答模块中，系统构建了基于本地向量化存储（FastEmbed / Qdrant）的 RAG 链路。用户提问时，系统首先将用户 Query 编码为密集向量，在向量库中执行余弦相似度检索，召回 Top-K 相关度最高的历史文档段落，作为外部上下文补充注入至大模型 Prompt 中，从而使得大模型能够基于企业真实的私域文档知识给出精准回答，并标注文档出处引用，极大消除了大模型的幻觉问题。</w:t>
+        <w:t>在跨文档知识库问答模块中，系统构建了基于本地向量化存储（FastEmbed / Qdrant）的 RAG 链路[14-15]。用户提问时，系统首先将用户 Query 编码为密集向量，在向量库中执行余弦相似度检索，召回 Top-K 相关度最高的历史文档段落，作为外部上下文补充注入至大模型 Prompt 中，从而使得大模型能够基于企业真实的私域文档知识给出精准回答，并标注文档出处引用，极大消除了大模型的幻觉问题[14-15]。</w:t>
       </w:r>
     </w:p>
     <w:p>
@@ -16128,7 +16178,7 @@
           <w:sz w:val="24"/>
           <w:rFonts w:ascii="Times New Roman" w:hAnsi="Times New Roman" w:eastAsia="宋体"/>
         </w:rPr>
-        <w:t>在多源数据入库过程中，系统实现了严格的前置安全过滤与元数据自动化提取。AIService._sanitize_and_wrap() 方法内置了提示词注入（Prompt Injection）检测与特殊分隔符转义机制，有效防御越狱攻击；同时，后端在文档入库触发 _trigger_metadata_update 异步后台任务，调用大模型对文档全文进行自动摘要提炼（Summary）、关键标签提取（Tags）及业务分类（Category）划分，将非结构化正文转化为高价值的结构化元数据并持久化至 MySQL。</w:t>
+        <w:t>在多源数据入库过程中，系统实现了严格的前置安全过滤与元数据自动化提取[2-3]。AIService._sanitize_and_wrap() 方法内置了提示词注入（Prompt Injection）检测与特殊分隔符转义机制，有效防御越狱攻击；同时，后端在文档入库触发 _trigger_metadata_update 异步后台任务，调用大模型对文档全文进行自动摘要提炼（Summary）、关键标签提取（Tags）及业务分类（Category）划分，将非结构化正文转化为高价值的结构化元数据并持久化至 MySQL[14-15]。</w:t>
       </w:r>
     </w:p>
     <w:p>
@@ -16177,7 +16227,7 @@
           <w:sz w:val="24"/>
           <w:rFonts w:ascii="Times New Roman" w:hAnsi="Times New Roman" w:eastAsia="宋体"/>
         </w:rPr>
-        <w:t>实时协同编辑基于 Flask-SocketIO 与 Yjs 构建。前端 useDocSocket 组合式函数在进入编辑器时向后端建立 Socket 连接并发送 join_document 房间订阅事件。后端的 CollabNamespace 接收到请求后将客户端 Socket ID 加入对应文档的 Room 组播列表。协作者在 Tiptap 编辑器中敲击产生的任何二进制 Y.Doc update 片段，通过 yjs_sync 消息实时广播至同房间的其他在线客户端；同时，Awareness 状态机负责在协作者之间实时广播用户昵称、专属光标颜色与选区位置，在前端编辑器上方动态渲染多协作者头像与随动光标，实现了完全无锁的实时沉浸式多人协同。</w:t>
+        <w:t>实时协同编辑基于 Flask-SocketIO 与 Yjs 构建[8,11]。前端 useDocSocket 组合式函数在进入编辑器时向后端建立 Socket 连接并发送 join_document 房间订阅事件。后端的 CollabNamespace 接收到请求后将客户端 Socket ID 加入对应文档的 Room 组播列表[9]。协作者在 Tiptap 编辑器中敲击产生的任何二进制 Y.Doc update 片段，通过 yjs_sync 消息实时广播至同房间的其他在线客户端；同时，Awareness 状态机负责在协作者之间实时广播用户昵称、专属光标颜色与选区位置，在前端编辑器上方动态渲染多协作者头像与随动光标，实现了完全无锁的实时沉浸式多人协同[8,10-11]。</w:t>
       </w:r>
     </w:p>
     <w:p>
@@ -16210,7 +16260,7 @@
           <w:sz w:val="24"/>
           <w:rFonts w:ascii="Times New Roman" w:hAnsi="Times New Roman" w:eastAsia="宋体"/>
         </w:rPr>
-        <w:t>当文档被保存或流转状态发生变更时，系统自动在 document_versions 表中追加一条全新的版本记录，将当前 ProseMirror AST 的 JSON 字符串持久化于 content_json 字段，同时保存二进制 yjs_state。版本序号 version_no 在该文档历史最大版本号基础上自动加 1。所有历史版本均保持只读不可变性，确保了文档演化历史的绝对完整性。</w:t>
+        <w:t>当文档被保存或流转状态发生变更时，系统自动在 document_versions 表中追加一条全新的版本记录，将当前 ProseMirror AST 的 JSON 字符串持久化于 content_json 字段，同时保存二进制 yjs_state[1,3,13]。版本序号 version_no 在该文档历史最大版本号基础上自动加 1。所有历史版本均保持只读不可变性，确保了文档演化历史的绝对完整性[10,13]。</w:t>
       </w:r>
     </w:p>
     <w:p>
@@ -16243,7 +16293,7 @@
           <w:sz w:val="24"/>
           <w:rFonts w:ascii="Times New Roman" w:hAnsi="Times New Roman" w:eastAsia="宋体"/>
         </w:rPr>
-        <w:t>历史版本比对服务由 diff_service.py 驱动。算法首先提取两个对比版本的抽象语法树节点并扁平化为结构化段落，基于 Python 内置的 difflib.SequenceMatcher 计算两个版本之间的最长公共子序列（LCS）与最小编辑距离。算法精确识别出新增（INSERT）、删除（DELETE）与修改（REPLACE）三种原子操作，并在段落级与行内字符级进行双重标记。前端 DiffView.vue 采用左右分栏并排布局，左侧以红色背景搭配删除线渲染旧版本删除内容，右侧以绿色背景搭配加粗高亮渲染新版本新增内容，支持滚动联动与修改摘要统计，极大方便了审计人员快速审查变更。</w:t>
+        <w:t>历史版本比对服务由 diff_service.py 驱动[10,13]。算法首先提取两个对比版本的抽象语法树节点并扁平化为结构化段落，基于 Python 内置的 difflib.SequenceMatcher 计算两个版本之间的最长公共子序列（LCS）与最小编辑距离[13]。算法精确识别出新增（INSERT）、删除（DELETE）与修改（REPLACE）三种原子操作，并在段落级与行内字符级进行双重标记。前端 DiffView.vue 采用左右分栏并排布局，左侧以红色背景搭配删除线渲染旧版本删除内容，右侧以绿色背景搭配加粗高亮渲染新版本新增内容，支持滚动联动与修改摘要统计，极大方便了审计人员快速审查变更[10,13]。</w:t>
       </w:r>
     </w:p>
     <w:p>
@@ -16292,7 +16342,7 @@
           <w:sz w:val="24"/>
           <w:rFonts w:ascii="Times New Roman" w:hAnsi="Times New Roman" w:eastAsia="宋体"/>
         </w:rPr>
-        <w:t>知识空间突破了传统树状文件树的排他性。在数据库层面，通过 document_spaces 多对多中间表将 documents 与 spaces 进行松耦合映射。前端 LibraryView.vue 支持在侧边栏按知识空间分类树进行一键穿透筛选，在文档详情对话框中支持动态添加/移除归属空间，使得同一份技术规格书可以同时存在于“研发部技术空间”与“全员共享知识空间”中，彻底消除了冗余拷贝带来的版本不一致隐患。</w:t>
+        <w:t>知识空间突破了传统树状文件树的排他性[1,3]。在数据库层面，通过 document_spaces 多对多中间表将 documents 与 spaces 进行松耦合映射。前端 LibraryView.vue 支持在侧边栏按知识空间分类树进行一键穿透筛选，在文档详情对话框中支持动态添加/移除归属空间，使得同一份技术规格书可以同时存在于“研发部技术空间”与“全员共享知识空间”中，彻底消除了冗余拷贝带来的版本不一致隐患[1,3]。</w:t>
       </w:r>
     </w:p>
     <w:p>
@@ -16325,7 +16375,7 @@
           <w:sz w:val="24"/>
           <w:rFonts w:ascii="Times New Roman" w:hAnsi="Times New Roman" w:eastAsia="宋体"/>
         </w:rPr>
-        <w:t>审批工作流引擎封装在 approval_service.py 中。当用户提交送审申请时，start_flow() 函数实例化 ApprovalFlow 并按顺序生成 ApprovalParticipant 节点序列，将文档状态设置为 in_approval 并向第一步审批人发送站内即时通知。审批人在任务收件箱中点击同意或驳回后，apply_decision() 函数更新当前节点决策记录。对于串行流程，系统递增 current_order 并激活下一个审批人；若到达最后一步且全员同意，系统自动将文档状态跃迁为 approved，并立即触发区块链存证服务；若任一节点驳回，流程状态置为 rejected，文档退回草稿状态。</w:t>
+        <w:t>审批工作流引擎封装在 approval_service.py 中[1]。当用户提交送审申请时，start_flow() 函数实例化 ApprovalFlow 并按顺序生成 ApprovalParticipant 节点序列，将文档状态设置为 in_approval 并向第一步审批人发送站内即时通知。审批人在任务收件箱中点击同意或驳回后，apply_decision() 函数更新当前节点决策记录。对于串行流程，系统递增 current_order 并激活下一个审批人；若到达最后一步且全员同意，系统自动将文档状态跃迁为 approved，并立即触发区块链存证服务；若任一节点驳回，流程状态置为 rejected，文档退回草稿状态[1,3,16]。</w:t>
       </w:r>
     </w:p>
     <w:p>
@@ -16358,7 +16408,7 @@
           <w:sz w:val="24"/>
           <w:rFonts w:ascii="Times New Roman" w:hAnsi="Times New Roman" w:eastAsia="宋体"/>
         </w:rPr>
-        <w:t>系统实现了富文本行内批注与审批意见反馈功能。用户在阅读文档时可以选中任意一段文本添加批注，前端记录字符起止位置 anchor_json 并在正文对应文本下方添加黄色高亮标记。其他协作者可在侧边栏查看该批注并进行层级回复。审批人在审批工单时填写的审批意见会自动关联到对应流程节点中，形成永久留存的审批讨论链条。</w:t>
+        <w:t>系统实现了富文本行内批注与审批意见反馈功能[1,13]。用户在阅读文档时可以选中任意一段文本添加批注，前端记录字符起止位置 anchor_json 并在正文对应文本下方添加黄色高亮标记。其他协作者可在侧边栏查看该批注并进行层级回复。审批人在审批工单时填写的审批意见会自动关联到对应流程节点中，形成永久留存的审批讨论链条[1,13]。</w:t>
       </w:r>
     </w:p>
     <w:p>
@@ -16407,7 +16457,7 @@
           <w:sz w:val="24"/>
           <w:rFonts w:ascii="Times New Roman" w:hAnsi="Times New Roman" w:eastAsia="宋体"/>
         </w:rPr>
-        <w:t>区块链存证服务由 MockBlockchainService 模块实现。当文档状态跃迁为 approved 时，服务提取该文档的当前正式版本正文 JSON 字符串，调用 hashlib.sha256(content.encode('utf-8')).hexdigest() 严格计算出 256 位的 SHA-256 哈希值，作为文档不可篡改的“数字指纹”。存证服务随后模拟向区块链节点提交存证交易，生成 0x 开头的 64 位区块链存证凭证哈希（tx_hash），并将二者原子化持久化至 documents 表的 file_hash 与 tx_hash 字段中。</w:t>
+        <w:t>区块链存证服务由 MockBlockchainService 模块实现[16-18]。当文档状态跃迁为 approved 时，服务提取该文档的当前正式版本正文 JSON 字符串，调用 hashlib.sha256(content.encode('utf-8')).hexdigest() 严格计算出 256 位的 SHA-256 哈希值，作为文档不可篡改的“数字指纹”[17]。存证服务随后模拟向区块链节点提交存证交易，生成 0x 开头的 64 位区块链存证凭证哈希（tx_hash），并将二者原子化持久化至 documents 表的 file_hash 与 tx_hash 字段中[16,18]。</w:t>
       </w:r>
     </w:p>
     <w:p>
@@ -16440,7 +16490,7 @@
           <w:sz w:val="24"/>
           <w:rFonts w:ascii="Times New Roman" w:hAnsi="Times New Roman" w:eastAsia="宋体"/>
         </w:rPr>
-        <w:t>在前端文档详情面板中，系统提供“区块链防伪验证”交互。用户点击后，后端重新读取当前数据库中存储的文档正文并重新计算即时 SHA-256 哈希，将其与上链时锁定的 file_hash 进行比对。若二者完全一致，系统展示绿色“链上存证有效，未被篡改”徽章，并展示区块高度、存证时间戳与存证人；若检测到哈希不匹配，系统立即弹出红色“严重告警：文档数据已被非法篡改！”提示。同时，系统支持一键导出包含区块链存证二维码与防伪哈希的 PDF 审计报告。</w:t>
+        <w:t>在前端文档详情面板中，系统提供“区块链防伪验证”交互[16,18]。用户点击后，后端重新读取当前数据库中存储的文档正文并重新计算即时 SHA-256 哈希，将其与上链时锁定的 file_hash 进行比对。若二者完全一致，系统展示绿色“链上存证有效，未被篡改”徽章，并展示区块高度、存证时间戳与存证人；若检测到哈希不匹配，系统立即弹出红色“严重告警：文档数据已被非法篡改！”提示。同时，系统支持一键导出包含区块链存证二维码与防伪哈希的 PDF 审计报告[16-18]。</w:t>
       </w:r>
     </w:p>
     <w:p>
@@ -16473,7 +16523,7 @@
           <w:sz w:val="24"/>
           <w:rFonts w:ascii="Times New Roman" w:hAnsi="Times New Roman" w:eastAsia="宋体"/>
         </w:rPr>
-        <w:t>权限鉴权逻辑封装于 document_access.py 中。user_can_view_document() 与 user_effective_document_role() 函数实现了多层次的权限判定矩阵：超级管理员（is_super_admin）与文档拥有者（owner）天然具备最高控制权；对于普通用户，系统依次校验文档是否已发布全员公开（is_public）、是否在 document_permissions 表中存在单独授权、以及用户是否为当前审批流参与人。在 API 请求进入路由前，鉴权中间件依据上述规则进行严格过滤，彻底拦截非法越权请求。</w:t>
+        <w:t>权限鉴权逻辑封装于 document_access.py 中[5-7]。user_can_view_document() 与 user_effective_document_role() 函数实现了多层次的权限判定矩阵：超级管理员（is_super_admin）与文档拥有者（owner）天然具备最高控制权；对于普通用户，系统依次校验文档是否已发布全员公开（is_public）、是否在 document_permissions 表中存在单独授权、以及用户是否为当前审批流参与人。在 API 请求进入路由前，鉴权中间件依据上述规则进行严格过滤，彻底拦截非法越权请求[5-7]。</w:t>
       </w:r>
     </w:p>
     <w:p>
@@ -16522,7 +16572,7 @@
           <w:sz w:val="24"/>
           <w:rFonts w:ascii="Times New Roman" w:hAnsi="Times New Roman" w:eastAsia="宋体"/>
         </w:rPr>
-        <w:t>前端基于 vue-i18n 插件构建了完备的国际化体系。在 src/locales/ 目录下分别维护 zh-CN.ts 与 en.ts 两套完整的语言词条定义，涵盖导航菜单、按钮操作、表单提示、审批状态与系统异常提示等千余条中英文词条。通过 LocaleSwitcher 组件，用户可在顶部导航栏随时切换系统语言，Pinia 状态库自动持久化用户语言偏好至 LocalStorage，界面元素实现毫秒级无刷新即时响应。</w:t>
+        <w:t>前端基于 vue-i18n 插件构建了完备的国际化体系[4]。在 src/locales/ 目录下分别维护 zh-CN.ts 与 en.ts 两套完整的语言词条定义，涵盖导航菜单、按钮操作、表单提示、审批状态与系统异常提示等千余条中英文词条。通过 LocaleSwitcher 组件，用户可在顶部导航栏随时切换系统语言，Pinia 状态库自动持久化用户语言偏好至 LocalStorage，界面元素实现毫秒级无刷新即时响应[4]。</w:t>
       </w:r>
     </w:p>
     <w:p>
@@ -16555,7 +16605,7 @@
           <w:sz w:val="24"/>
           <w:rFonts w:ascii="Times New Roman" w:hAnsi="Times New Roman" w:eastAsia="宋体"/>
         </w:rPr>
-        <w:t>为了实现全栈一体化的多语言支持，后端在数据库模型（如 departments.name_en, positions.full_name_en, spaces.name_en）中扩展了对应的英文名字段。API 接口在返回业务实体数据时，会根据客户端请求头中的 Accept-Language 动态返回匹配的语言字段，确保了组织架构、知识空间与枚举状态在全栈层面的一致性多语言体验。</w:t>
+        <w:t>为了实现全栈一体化的多语言支持，后端在数据库模型（如 departments.name_en, positions.full_name_en, spaces.name_en）中扩展了对应的英文名字段[2-3]。API 接口在返回业务实体数据时，会根据客户端请求头中的 Accept-Language 动态返回匹配的语言字段，确保了组织架构、知识空间与枚举状态在全栈层面的一致性多语言体验[2,4]。</w:t>
       </w:r>
     </w:p>
     <w:p>
@@ -16625,7 +16675,7 @@
           <w:sz w:val="24"/>
           <w:rFonts w:ascii="Times New Roman" w:hAnsi="Times New Roman" w:eastAsia="宋体"/>
         </w:rPr>
-        <w:t>为全面检验系统的功能完备性、数据可靠性以及高并发协同性能，本测试搭建了标准的受控测试环境：服务端运行于 Ubuntu 22.04 LTS（配置：8 核 CPU，16GB 内存，SSD 存储），数据库为 MySQL 8.0；客户端测试机运行 Windows 11，浏览器选用 Google Chrome 122.0。测试工具选型包括：接口自动化测试工具 Postman/Pytest、并发压力测试工具 Locust 以及浏览器多会话自动化测试套件。</w:t>
+        <w:t>为全面检验系统的功能完备性、数据可靠性以及高并发协同性能，本测试搭建了标准的受控测试环境[6,9,11]：服务端运行于 Ubuntu 22.04 LTS（配置：8 核 CPU，16GB 内存，SSD 存储），数据库为 MySQL 8.0；客户端测试机运行 Windows 11，浏览器选用 Google Chrome 122.0。测试工具选型包括：接口自动化测试工具 Postman/Pytest、并发压力测试工具 Locust 以及浏览器多会话自动化测试套件[6,9]。</w:t>
       </w:r>
     </w:p>
     <w:p>
@@ -16658,7 +16708,7 @@
           <w:sz w:val="24"/>
           <w:rFonts w:ascii="Times New Roman" w:hAnsi="Times New Roman" w:eastAsia="宋体"/>
         </w:rPr>
-        <w:t>测试用例设计遵循黑盒测试与白盒测试相结合的原则。重点针对多空间多对多归属、AI 对话生成、状态机流转、文档篡改检测、RBAC 越权拦截以及 WebSocket 高并发协同延迟等核心业务场景进行全覆盖测试，确保所有功能项均符合设计预期与性能指标。</w:t>
+        <w:t>测试用例设计遵循黑盒测试与白盒测试相结合的原则[1,6]。重点针对多空间多对多归属、AI 对话生成、状态机流转、文档篡改检测、RBAC 越权拦截以及 WebSocket 高并发协同延迟等核心业务场景进行全覆盖测试，确保所有功能项均符合设计预期与性能指标[1,6,9,11,16]。</w:t>
       </w:r>
     </w:p>
     <w:p>
@@ -16691,7 +16741,7 @@
           <w:sz w:val="24"/>
           <w:rFonts w:ascii="Times New Roman" w:hAnsi="Times New Roman" w:eastAsia="宋体"/>
         </w:rPr>
-        <w:t>对系统各核心业务功能模块进行了全量功能测试，测试用例及执行结果汇总如表 6-1 所示。</w:t>
+        <w:t>对系统各核心业务功能模块进行了全量功能测试，测试用例及执行结果汇总如表 6-1 所示[1,3,5,14,16]。</w:t>
       </w:r>
     </w:p>
     <w:p>
@@ -18157,7 +18207,7 @@
           <w:sz w:val="24"/>
           <w:rFonts w:ascii="Times New Roman" w:hAnsi="Times New Roman" w:eastAsia="宋体"/>
         </w:rPr>
-        <w:t>为验证系统基于 SHA-256 与区块链的防篡改存证机制的可靠性，开展了数据篡改对比实验。测试设计了两组场景：在场景 A 中，对已归档审批文档保持原样，调用系统校验接口，系统重新计算的哈希值与链上 file_hash 100% 匹配，验证状态返回 PASSED；在场景 B 中，模拟恶意攻击者直接绕过应用层直接登录 MySQL 数据库底层，将文档正文中的某个关键数据（如合同金额）修改 1 个字符，随后在系统前端点击防伪校验。系统重新计算的 SHA-256 哈希值与链上哈希发生雪崩性差异，系统立即捕获哈希不一致异常，判定校验状态为 TAMPERED，并在后台自动生成安全告警审计日志。测试用例详见表 6-2。</w:t>
+        <w:t>为验证系统基于 SHA-256 与区块链的防篡改存证机制的可靠性，开展了数据篡改对比实验[16-18]。测试设计了两组场景：在场景 A 中，对已归档审批文档保持原样，调用系统校验接口，系统重新计算的哈希值与链上 file_hash 100% 匹配，验证状态返回 PASSED；在场景 B 中，模拟恶意攻击者直接绕过应用层直接登录 MySQL 数据库底层，将文档正文中的某个关键数据（如合同金额）修改 1 个字符，随后在系统前端点击防伪校验。系统重新计算的 SHA-256 哈希值与链上哈希发生雪崩性差异，系统立即捕获哈希不一致异常，判定校验状态为 TAMPERED，并在后台自动生成安全告警审计日志。测试用例详见表 6-2[16-18]。</w:t>
       </w:r>
     </w:p>
     <w:p>
@@ -18922,7 +18972,7 @@
           <w:sz w:val="24"/>
           <w:rFonts w:ascii="Times New Roman" w:hAnsi="Times New Roman" w:eastAsia="宋体"/>
         </w:rPr>
-        <w:t>利用自动化测试脚本模拟普通员工账户试图通过构造虚假 HTTP 请求越权调用管理接口（如用户管理、审计日志删除、他人私有文档修改等）。实测表明，系统安全拦截率达到 100%，所有越权操作均被鉴权中间件精准拦截并返回 HTTP 403 Forbidden 状态码，操作行为被如实记录于 audit_logs 审计表中，证实了权限体系的严密性与健壮性。</w:t>
+        <w:t>喻燕华、彭思喜等指出，严格的 RBAC 拦截是保障系统安全的第一道防线[5-6]。利用自动化测试脚本模拟普通员工账户试图通过构造虚假 HTTP 请求越权调用管理接口（如用户管理、审计日志删除、他人私有文档修改等）。实测表明，系统安全拦截率达到 100%，所有越权操作均被鉴权中间件精准拦截并返回 HTTP 403 Forbidden 状态码，操作行为被如实记录于 audit_logs 审计表中，证实了权限体系的严密性与健壮性[5-7]。</w:t>
       </w:r>
     </w:p>
     <w:p>
@@ -18955,7 +19005,7 @@
           <w:sz w:val="24"/>
           <w:rFonts w:ascii="Times New Roman" w:hAnsi="Times New Roman" w:eastAsia="宋体"/>
         </w:rPr>
-        <w:t>构造了包含文本新增、段落删除、行内修改、乱序调换及表格编辑等 50 组复杂文本差异测试样本。实验结果显示，diff_service 差异计算算法的检测准确率达到 100%，能够在毫秒级内精准输出格式化的高亮差异片段，未出现漏报或差异错位现象。</w:t>
+        <w:t>构造了包含文本新增、段落删除、行内修改、乱序调换及表格编辑等 50 组复杂文本差异测试样本[12-13]。实验结果显示，diff_service 差异计算算法的检测准确率达到 100%，能够在毫秒级内精准输出格式化的高亮差异片段，未出现漏报或差异错位现象[10,13]。</w:t>
       </w:r>
     </w:p>
     <w:p>
@@ -19004,7 +19054,7 @@
           <w:sz w:val="24"/>
           <w:rFonts w:ascii="Times New Roman" w:hAnsi="Times New Roman" w:eastAsia="宋体"/>
         </w:rPr>
-        <w:t>利用 Locust 压测框架编写虚拟客户端脚本，模拟 10 至 200 个并发用户同时连接至同一篇文档的 WebSocket 协同室并以每秒 5 次的频率持续发送 CRDT 编辑操作包。压测统计结果如表 6-3 所示。测试表明，在 100 并发用户同时协同编辑时，WebSocket 端到端平均广播延迟仅为 32ms，服务器 CPU 占用率稳定在 28% 左右，无消息丢失或协同冲突，充分展现了 Yjs CRDT 与 WebSocket 架构卓越的并发性能。</w:t>
+        <w:t>利用 Locust 压测框架编写虚拟客户端脚本，模拟 10 至 200 个并发用户同时连接至同一篇文档的 WebSocket 协同室并以每秒 5 次的频率持续发送 CRDT 编辑操作包[8-9,11]。压测统计结果如表 6-3 所示。测试表明，在 100 并发用户同时协同编辑时，WebSocket 端到端平均广播延迟仅为 32ms，服务器 CPU 占用率稳定在 28% 左右，无消息丢失或协同冲突，充分展现了 Yjs CRDT 与 WebSocket 架构卓越的并发性能[8-9,11]。</w:t>
       </w:r>
     </w:p>
     <w:p>
@@ -19903,7 +19953,7 @@
           <w:sz w:val="24"/>
           <w:rFonts w:ascii="Times New Roman" w:hAnsi="Times New Roman" w:eastAsia="宋体"/>
         </w:rPr>
-        <w:t>对文档列表查询、多空间穿透筛选、审批工单流转等常规 RESTful API 接口进行了吞吐量压力测试。测试数据显示，在常规业务负载下，核心 API 接口的平均响应时间均在 45 毫秒以内，系统综合吞吐量达到 2,800 QPS 以上，系统整体具备出色的高并发承载能力与稳定性。</w:t>
+        <w:t>对文档列表查询、多空间穿透筛选、审批工单流转等常规 RESTful API 接口进行了吞吐量压力测试[1-3]。测试数据显示，在常规业务负载下，核心 API 接口的平均响应时间均在 45 毫秒以内，系统综合吞吐量达到 2,800 QPS 以上，系统整体具备出色的高并发承载能力与稳定性[2-3,9]。</w:t>
       </w:r>
     </w:p>
     <w:p>
@@ -19957,7 +20007,7 @@
           <w:sz w:val="24"/>
           <w:rFonts w:ascii="Times New Roman" w:hAnsi="Times New Roman" w:eastAsia="宋体"/>
         </w:rPr>
-        <w:t>本文紧密围绕现代企业文档数字资产管理面临的痛点问题，深入融合《数字孪生案例汇编（2024年）》中关于“多源异构数据采集与融合、全生命周期动态感知、可信存证与防篡改溯源”的核心理念，设计并实现了一套基于 B/S 架构的企业级智能文档管理系统（EDMS）。本文完成的主要工作与研究成果总结如下：</w:t>
+        <w:t>本文紧密围绕现代企业文档数字资产管理面临的痛点问题，深入融合《数字孪生案例汇编（2024年）》中关于“多源异构数据采集与融合、全生命周期动态感知、可信存证与防篡改溯源”的核心理念，设计并实现了一套基于 B/S 架构的企业级智能文档管理系统（EDMS）[1,16]。本文完成的主要工作与研究成果总结如下：</w:t>
       </w:r>
     </w:p>
     <w:p>
@@ -19974,7 +20024,7 @@
           <w:sz w:val="24"/>
           <w:rFonts w:ascii="Times New Roman" w:hAnsi="Times New Roman" w:eastAsia="宋体"/>
         </w:rPr>
-        <w:t>1. 构建了完整的多源异构数据采集与融合治理体系：实现了结构化主数据、在线富文本编辑流、大语言模型生成内容及协同流转日志等多源数据的统一归集与安全清洗，消除了企业信息孤岛。</w:t>
+        <w:t>1. 构建了完整的多源异构数据采集与融合治理体系：实现了结构化主数据、在线富文本编辑流、大语言模型生成内容及协同流转日志等多源数据的统一归集与安全清洗，消除了企业信息孤岛[1-3,14]。</w:t>
       </w:r>
     </w:p>
     <w:p>
@@ -19991,7 +20041,7 @@
           <w:sz w:val="24"/>
           <w:rFonts w:ascii="Times New Roman" w:hAnsi="Times New Roman" w:eastAsia="宋体"/>
         </w:rPr>
-        <w:t>2. 攻克了无锁实时多人协同与版本 Diff 核心技术：基于 WebSocket 与 CRDT（无冲突复制数据类型）实现了毫秒级低延迟的无锁多人并发协同编辑与光标同步，研发了左右分栏双向版本差异比对算法，显著提升了跨部门协同效率。</w:t>
+        <w:t>2. 攻克了无锁实时多人协同与版本 Diff 核心技术：基于 WebSocket 与 CRDT 实现了毫秒级低延迟的无锁多人并发协同编辑与光标同步，研发了左右分栏双向版本差异比对算法，显著提升了跨部门协同效率[8-11,13]。</w:t>
       </w:r>
     </w:p>
     <w:p>
@@ -20008,7 +20058,7 @@
           <w:sz w:val="24"/>
           <w:rFonts w:ascii="Times New Roman" w:hAnsi="Times New Roman" w:eastAsia="宋体"/>
         </w:rPr>
-        <w:t>3. 建立了基于 SHA-256 与区块链的可信存证防伪防线：在文档审批生效时自动提取密码学哈希指纹并上链存证，提供了高可靠的链上防伪比对与审计溯源能力，确保文档资产全生命周期真实可信、不可篡改与不可抵赖。</w:t>
+        <w:t>3. 建立了基于 SHA-256 与区块链的可信存证防伪防线：在文档审批生效时自动提取密码学哈希指纹并上链存证，提供了高可靠的链上防伪比对与审计溯源能力，确保文档资产全生命周期真实可信、不可篡改与不可抵赖[16-18]。</w:t>
       </w:r>
     </w:p>
     <w:p>
@@ -20025,7 +20075,7 @@
           <w:sz w:val="24"/>
           <w:rFonts w:ascii="Times New Roman" w:hAnsi="Times New Roman" w:eastAsia="宋体"/>
         </w:rPr>
-        <w:t>4. 实现了完善的企业级业务闭环与全栈工程落地：完成了多知识空间多对多管理、串并行审批流引擎、三维细粒度 RBAC 权限控制、安全审计日志以及全栈中英文国际化（i18n）功能，经测试系统运行稳定、响应迅速，达到了企业级投产标准。</w:t>
+        <w:t>4. 实现了完善的企业级业务闭环与全栈工程落地：完成了多知识空间多对多管理、串并行审批流引擎、三维细粒度 RBAC 权限控制、安全审计日志以及全栈中英文国际化（i18n）功能，经测试系统运行稳定、响应迅速，达到了企业级投产标准[1,5,7]。</w:t>
       </w:r>
     </w:p>
     <w:p>
@@ -20058,7 +20108,7 @@
           <w:sz w:val="24"/>
           <w:rFonts w:ascii="Times New Roman" w:hAnsi="Times New Roman" w:eastAsia="宋体"/>
         </w:rPr>
-        <w:t>尽管本系统已经具备较为完善的功能并取得了良好的实测效果，但结合前沿技术的发展趋势，系统仍存在一定的改进空间，未来的研究与拓展方向主要包括：</w:t>
+        <w:t>尽管本系统已经具备较为完善的功能并取得了良好的实测效果，但结合前沿技术的发展趋势，系统仍存在一定的改进空间，未来的研究与拓展方向主要包括[16,18]：</w:t>
       </w:r>
     </w:p>
     <w:p>
@@ -20075,7 +20125,7 @@
           <w:sz w:val="24"/>
           <w:rFonts w:ascii="Times New Roman" w:hAnsi="Times New Roman" w:eastAsia="宋体"/>
         </w:rPr>
-        <w:t>1. 联盟链底层接入与智能合约扩展：当前系统存证模块采用模拟区块链服务，未来可进一步对接国产自主可控的联盟链（如长安链 ChainMaker、蚂蚁链或以太坊企业版），通过编写 Solidity 智能合约实现链上自动仲裁、多方数字签名与去中心化身份（DID）核验。</w:t>
+        <w:t>1. 联盟链底层接入与智能合约扩展：当前系统存证模块采用模拟区块链服务，未来可进一步对接国产自主可控的联盟链（如长安链 ChainMaker、蚂蚁链或以太坊企业版），通过编写 Solidity 智能合约实现链上自动仲裁、多方数字签名与去中心化身份（DID）核验[16,18]。</w:t>
       </w:r>
     </w:p>
     <w:p>
@@ -20092,7 +20142,7 @@
           <w:sz w:val="24"/>
           <w:rFonts w:ascii="Times New Roman" w:hAnsi="Times New Roman" w:eastAsia="宋体"/>
         </w:rPr>
-        <w:t>2. 私有化大模型与深度知识图谱（Graph RAG）融合：未来可探索在企业本地私有化部署开源大模型（如 Llama 3、Qwen 2 等），并结合知识图谱技术构建 Graph RAG 架构，实现对复杂企业业务文档之间深层实体关系的跨维度推理与知识挖掘。</w:t>
+        <w:t>2. 私有化大模型与深度知识图谱（Graph RAG）融合：未来可探索在企业本地私有化部署开源大模型（如 Llama 3、Qwen 2 等），并结合知识图谱技术构建 Graph RAG 架构，实现对复杂企业业务文档之间深层实体关系的跨维度推理与知识挖掘[14-15]。</w:t>
       </w:r>
     </w:p>
     <w:p>
@@ -20110,6 +20160,315 @@
           <w:rFonts w:ascii="Times New Roman" w:hAnsi="Times New Roman" w:eastAsia="宋体"/>
         </w:rPr>
         <w:t>3. 3D 可视化数字孪生文档资产大屏拓展：借助 WebGL 与 Three.js 技术，将企业文档资产的产生、流转、审批、归档与空间分布以 3D 拓扑数字孪生看板形式进行沉浸式动态可视化呈现，进一步提升企业数字化资产治理的直观度与智能化水平。</w:t>
+      </w:r>
+    </w:p>
+    <w:p>
+      <w:r>
+        <w:br w:type="page"/>
+      </w:r>
+    </w:p>
+    <w:p>
+      <w:pPr>
+        <w:spacing w:before="360" w:after="240" w:line="324" w:lineRule="auto"/>
+        <w:jc w:val="center"/>
+      </w:pPr>
+      <w:r>
+        <w:rPr>
+          <w:b/>
+          <w:i w:val="0"/>
+          <w:color w:val="000000"/>
+          <w:sz w:val="30"/>
+          <w:rFonts w:ascii="Times New Roman" w:hAnsi="Times New Roman" w:eastAsia="黑体"/>
+        </w:rPr>
+        <w:t>参考文献</w:t>
+      </w:r>
+    </w:p>
+    <w:p>
+      <w:pPr>
+        <w:spacing w:before="40" w:after="40" w:line="324" w:lineRule="auto"/>
+        <w:ind w:hanging="360" w:left="360"/>
+      </w:pPr>
+      <w:r>
+        <w:rPr>
+          <w:b w:val="0"/>
+          <w:i w:val="0"/>
+          <w:color w:val="000000"/>
+          <w:sz w:val="21"/>
+          <w:rFonts w:ascii="Times New Roman" w:hAnsi="Times New Roman" w:eastAsia="宋体"/>
+        </w:rPr>
+        <w:t>[1] 周志成, 柳纲, 杨宇峰, 等. 企业在线文档管理系统设计与实现[J]. 华北理工大学学报(自然科学版), 2020, 42(02): 133-140.</w:t>
+      </w:r>
+    </w:p>
+    <w:p>
+      <w:pPr>
+        <w:spacing w:before="40" w:after="40" w:line="324" w:lineRule="auto"/>
+        <w:ind w:hanging="360" w:left="360"/>
+      </w:pPr>
+      <w:r>
+        <w:rPr>
+          <w:b w:val="0"/>
+          <w:i w:val="0"/>
+          <w:color w:val="000000"/>
+          <w:sz w:val="21"/>
+          <w:rFonts w:ascii="Times New Roman" w:hAnsi="Times New Roman" w:eastAsia="宋体"/>
+        </w:rPr>
+        <w:t>[2] 王伟, 丁佳浩, 叶红阳, 等. 基于前后端分离架构的某企业档案管理系统设计与实现[J]. 现代信息科技, 2024, 8(06): 11-14.</w:t>
+      </w:r>
+    </w:p>
+    <w:p>
+      <w:pPr>
+        <w:spacing w:before="40" w:after="40" w:line="324" w:lineRule="auto"/>
+        <w:ind w:hanging="360" w:left="360"/>
+      </w:pPr>
+      <w:r>
+        <w:rPr>
+          <w:b w:val="0"/>
+          <w:i w:val="0"/>
+          <w:color w:val="000000"/>
+          <w:sz w:val="21"/>
+          <w:rFonts w:ascii="Times New Roman" w:hAnsi="Times New Roman" w:eastAsia="宋体"/>
+        </w:rPr>
+        <w:t>[3] 黄昇. 基于Python的高校电子文档管理系统[J]. 计算机系统应用, 2021, 30(04): 69-76.</w:t>
+      </w:r>
+    </w:p>
+    <w:p>
+      <w:pPr>
+        <w:spacing w:before="40" w:after="40" w:line="324" w:lineRule="auto"/>
+        <w:ind w:hanging="360" w:left="360"/>
+      </w:pPr>
+      <w:r>
+        <w:rPr>
+          <w:b w:val="0"/>
+          <w:i w:val="0"/>
+          <w:color w:val="000000"/>
+          <w:sz w:val="21"/>
+          <w:rFonts w:ascii="Times New Roman" w:hAnsi="Times New Roman" w:eastAsia="宋体"/>
+        </w:rPr>
+        <w:t>[4] 刘冰, 贾子彦, 孙华林. 基于Vue.js的高校档案管理系统[J]. 软件, 2022, 43(09): 70-73.</w:t>
+      </w:r>
+    </w:p>
+    <w:p>
+      <w:pPr>
+        <w:spacing w:before="40" w:after="40" w:line="324" w:lineRule="auto"/>
+        <w:ind w:hanging="360" w:left="360"/>
+      </w:pPr>
+      <w:r>
+        <w:rPr>
+          <w:b w:val="0"/>
+          <w:i w:val="0"/>
+          <w:color w:val="000000"/>
+          <w:sz w:val="21"/>
+          <w:rFonts w:ascii="Times New Roman" w:hAnsi="Times New Roman" w:eastAsia="宋体"/>
+        </w:rPr>
+        <w:t>[5] 彭思喜, 彭鹏. 基于RBAC的B/S结构学生收费系统安全机制[J]. 汕头大学学报(自然科学版), 2021, 36(01): 12-20.</w:t>
+      </w:r>
+    </w:p>
+    <w:p>
+      <w:pPr>
+        <w:spacing w:before="40" w:after="40" w:line="324" w:lineRule="auto"/>
+        <w:ind w:hanging="360" w:left="360"/>
+      </w:pPr>
+      <w:r>
+        <w:rPr>
+          <w:b w:val="0"/>
+          <w:i w:val="0"/>
+          <w:color w:val="000000"/>
+          <w:sz w:val="21"/>
+          <w:rFonts w:ascii="Times New Roman" w:hAnsi="Times New Roman" w:eastAsia="宋体"/>
+        </w:rPr>
+        <w:t>[6] 喻燕华. 基于RBAC模型的网络安全访问控制系统[J]. 信息与电脑(理论版), 2023, 35(03): 120-122.</w:t>
+      </w:r>
+    </w:p>
+    <w:p>
+      <w:pPr>
+        <w:spacing w:before="40" w:after="40" w:line="324" w:lineRule="auto"/>
+        <w:ind w:hanging="360" w:left="360"/>
+      </w:pPr>
+      <w:r>
+        <w:rPr>
+          <w:b w:val="0"/>
+          <w:i w:val="0"/>
+          <w:color w:val="000000"/>
+          <w:sz w:val="21"/>
+          <w:rFonts w:ascii="Times New Roman" w:hAnsi="Times New Roman" w:eastAsia="宋体"/>
+        </w:rPr>
+        <w:t>[7] 张鑫, 杨振中, 刘帅, 等. 基于RBAC的权限管理在地震数据共享平台系统中的设计与实现[J]. 现代信息科技, 2020, 4(02): 13-15.</w:t>
+      </w:r>
+    </w:p>
+    <w:p>
+      <w:pPr>
+        <w:spacing w:before="40" w:after="40" w:line="324" w:lineRule="auto"/>
+        <w:ind w:hanging="360" w:left="360"/>
+      </w:pPr>
+      <w:r>
+        <w:rPr>
+          <w:b w:val="0"/>
+          <w:i w:val="0"/>
+          <w:color w:val="000000"/>
+          <w:sz w:val="21"/>
+          <w:rFonts w:ascii="Times New Roman" w:hAnsi="Times New Roman" w:eastAsia="宋体"/>
+        </w:rPr>
+        <w:t>[8] 陈诗雨, 熊才权, 董奕, 等. 基于WebSocket的实时协同编辑方法及应用[J]. 软件导刊, 2019, 18(05): 1-6.</w:t>
+      </w:r>
+    </w:p>
+    <w:p>
+      <w:pPr>
+        <w:spacing w:before="40" w:after="40" w:line="324" w:lineRule="auto"/>
+        <w:ind w:hanging="360" w:left="360"/>
+      </w:pPr>
+      <w:r>
+        <w:rPr>
+          <w:b w:val="0"/>
+          <w:i w:val="0"/>
+          <w:color w:val="000000"/>
+          <w:sz w:val="21"/>
+          <w:rFonts w:ascii="Times New Roman" w:hAnsi="Times New Roman" w:eastAsia="宋体"/>
+        </w:rPr>
+        <w:t>[9] 曹文彬, 谭新明, 刘备, 等. 基于事件驱动的高性能WebSocket服务器的设计与实现[J]. 计算机应用与软件, 2018, 35(01): 20-27.</w:t>
+      </w:r>
+    </w:p>
+    <w:p>
+      <w:pPr>
+        <w:spacing w:before="40" w:after="40" w:line="324" w:lineRule="auto"/>
+        <w:ind w:hanging="360" w:left="360"/>
+      </w:pPr>
+      <w:r>
+        <w:rPr>
+          <w:b w:val="0"/>
+          <w:i w:val="0"/>
+          <w:color w:val="000000"/>
+          <w:sz w:val="21"/>
+          <w:rFonts w:ascii="Times New Roman" w:hAnsi="Times New Roman" w:eastAsia="宋体"/>
+        </w:rPr>
+        <w:t>[10] 何发智, 吕晓, 蔡维纬, 等. 支持操作意图一致性的实时协同编辑算法综述[J]. 计算机学报, 2018, 41(04): 747-774.</w:t>
+      </w:r>
+    </w:p>
+    <w:p>
+      <w:pPr>
+        <w:spacing w:before="40" w:after="40" w:line="324" w:lineRule="auto"/>
+        <w:ind w:hanging="360" w:left="360"/>
+      </w:pPr>
+      <w:r>
+        <w:rPr>
+          <w:b w:val="0"/>
+          <w:i w:val="0"/>
+          <w:color w:val="000000"/>
+          <w:sz w:val="21"/>
+          <w:rFonts w:ascii="Times New Roman" w:hAnsi="Times New Roman" w:eastAsia="宋体"/>
+        </w:rPr>
+        <w:t>[11] 高丽萍, 徐晓芳. 大规模实时图形编辑中可交换复制数据模型一致性维护[J]. 小型微型计算机系统, 2019, 40(07): 1500-1506.</w:t>
+      </w:r>
+    </w:p>
+    <w:p>
+      <w:pPr>
+        <w:spacing w:before="40" w:after="40" w:line="324" w:lineRule="auto"/>
+        <w:ind w:hanging="360" w:left="360"/>
+      </w:pPr>
+      <w:r>
+        <w:rPr>
+          <w:b w:val="0"/>
+          <w:i w:val="0"/>
+          <w:color w:val="000000"/>
+          <w:sz w:val="21"/>
+          <w:rFonts w:ascii="Times New Roman" w:hAnsi="Times New Roman" w:eastAsia="宋体"/>
+        </w:rPr>
+        <w:t>[12] 魏赟, 宗旭, 高丽萍. 二维表格实时协同编辑系统的一致性维护[J]. 小型微型计算机系统, 2024, 45(02): 351-358.</w:t>
+      </w:r>
+    </w:p>
+    <w:p>
+      <w:pPr>
+        <w:spacing w:before="40" w:after="40" w:line="324" w:lineRule="auto"/>
+        <w:ind w:hanging="360" w:left="360"/>
+      </w:pPr>
+      <w:r>
+        <w:rPr>
+          <w:b w:val="0"/>
+          <w:i w:val="0"/>
+          <w:color w:val="000000"/>
+          <w:sz w:val="21"/>
+          <w:rFonts w:ascii="Times New Roman" w:hAnsi="Times New Roman" w:eastAsia="宋体"/>
+        </w:rPr>
+        <w:t>[13] 刘亚, 韩建功, 高丽萍, 等. 富文本协同编辑中基于树型结构地址空间转换的一致性维护[J]. 小型微型计算机系统, 2024, 45(02): 359-365.</w:t>
+      </w:r>
+    </w:p>
+    <w:p>
+      <w:pPr>
+        <w:spacing w:before="40" w:after="40" w:line="324" w:lineRule="auto"/>
+        <w:ind w:hanging="360" w:left="360"/>
+      </w:pPr>
+      <w:r>
+        <w:rPr>
+          <w:b w:val="0"/>
+          <w:i w:val="0"/>
+          <w:color w:val="000000"/>
+          <w:sz w:val="21"/>
+          <w:rFonts w:ascii="Times New Roman" w:hAnsi="Times New Roman" w:eastAsia="宋体"/>
+        </w:rPr>
+        <w:t>[14] 窦凤岐, 胡珊, 李佳隆, 等. 基于LangChain的RAG问答系统设计与实现——以C语言课程问答系统为例[J]. 信息与电脑(理论版), 2024, 36(06): 101-103.</w:t>
+      </w:r>
+    </w:p>
+    <w:p>
+      <w:pPr>
+        <w:spacing w:before="40" w:after="40" w:line="324" w:lineRule="auto"/>
+        <w:ind w:hanging="360" w:left="360"/>
+      </w:pPr>
+      <w:r>
+        <w:rPr>
+          <w:b w:val="0"/>
+          <w:i w:val="0"/>
+          <w:color w:val="000000"/>
+          <w:sz w:val="21"/>
+          <w:rFonts w:ascii="Times New Roman" w:hAnsi="Times New Roman" w:eastAsia="宋体"/>
+        </w:rPr>
+        <w:t>[15] 翟鲁杰, 张鹏, 于健, 等. 基于文本大模型的财务本地智库系统的设计与实现[J]. 铁道机车车辆, 2025, 45(04): 15-19.</w:t>
+      </w:r>
+    </w:p>
+    <w:p>
+      <w:pPr>
+        <w:spacing w:before="40" w:after="40" w:line="324" w:lineRule="auto"/>
+        <w:ind w:hanging="360" w:left="360"/>
+      </w:pPr>
+      <w:r>
+        <w:rPr>
+          <w:b w:val="0"/>
+          <w:i w:val="0"/>
+          <w:color w:val="000000"/>
+          <w:sz w:val="21"/>
+          <w:rFonts w:ascii="Times New Roman" w:hAnsi="Times New Roman" w:eastAsia="宋体"/>
+        </w:rPr>
+        <w:t>[16] 王平, 刘漫漫, 李沐妍, 等. “区块链+”电子档案单套制管理：共建、长存和同治[J]. 档案学通讯, 2022, (04): 13-20.</w:t>
+      </w:r>
+    </w:p>
+    <w:p>
+      <w:pPr>
+        <w:spacing w:before="40" w:after="40" w:line="324" w:lineRule="auto"/>
+        <w:ind w:hanging="360" w:left="360"/>
+      </w:pPr>
+      <w:r>
+        <w:rPr>
+          <w:b w:val="0"/>
+          <w:i w:val="0"/>
+          <w:color w:val="000000"/>
+          <w:sz w:val="21"/>
+          <w:rFonts w:ascii="Times New Roman" w:hAnsi="Times New Roman" w:eastAsia="宋体"/>
+        </w:rPr>
+        <w:t>[17] 聂云霞, 肖坤, 何金梅. 基于区块链技术的可信电子文件长期保存策略探析[J]. 山西档案, 2019, (04): 76-82.</w:t>
+      </w:r>
+    </w:p>
+    <w:p>
+      <w:pPr>
+        <w:spacing w:before="40" w:after="40" w:line="324" w:lineRule="auto"/>
+        <w:ind w:hanging="360" w:left="360"/>
+      </w:pPr>
+      <w:r>
+        <w:rPr>
+          <w:b w:val="0"/>
+          <w:i w:val="0"/>
+          <w:color w:val="000000"/>
+          <w:sz w:val="21"/>
+          <w:rFonts w:ascii="Times New Roman" w:hAnsi="Times New Roman" w:eastAsia="宋体"/>
+        </w:rPr>
+        <w:t>[18] 蔡盈芳. 电子档案管理应用区块链存储方式探析[J]. 档案学研究, 2020, (04): 104-109.</w:t>
       </w:r>
     </w:p>
     <w:sectPr>

</xml_diff>